<commit_message>
Add audio files, peaks, and protocol documents for AVT UE-3
Added various speech audio files and their corresponding Reaper peak files for different sample rates to the AVT reaper template. Included protocol documents (PDF and DOCX) and updated the Obsidian note to reference the new protocol PDF. These changes support documentation and resources for the AVT1 UE-03 exercise.
</commit_message>
<xml_diff>
--- a/Modules/Semester_1/Video Audio Technik/Übungen Audio/UE-3/Protokoll.docx
+++ b/Modules/Semester_1/Video Audio Technik/Übungen Audio/UE-3/Protokoll.docx
@@ -467,27 +467,7 @@
                                           <w:sz w:val="84"/>
                                           <w:szCs w:val="84"/>
                                         </w:rPr>
-                                        <w:t xml:space="preserve">AVT1 </w:t>
-                                      </w:r>
-                                      <w:proofErr w:type="spellStart"/>
-                                      <w:r>
-                                        <w:rPr>
-                                          <w:rFonts w:ascii="Adobe Garamond Pro" w:eastAsiaTheme="majorEastAsia" w:hAnsi="Adobe Garamond Pro" w:cstheme="majorBidi"/>
-                                          <w:color w:val="FFFFFF" w:themeColor="background1"/>
-                                          <w:sz w:val="84"/>
-                                          <w:szCs w:val="84"/>
-                                        </w:rPr>
-                                        <w:t>Abgabe</w:t>
-                                      </w:r>
-                                      <w:proofErr w:type="spellEnd"/>
-                                      <w:r>
-                                        <w:rPr>
-                                          <w:rFonts w:ascii="Adobe Garamond Pro" w:eastAsiaTheme="majorEastAsia" w:hAnsi="Adobe Garamond Pro" w:cstheme="majorBidi"/>
-                                          <w:color w:val="FFFFFF" w:themeColor="background1"/>
-                                          <w:sz w:val="84"/>
-                                          <w:szCs w:val="84"/>
-                                        </w:rPr>
-                                        <w:t xml:space="preserve"> </w:t>
+                                        <w:t xml:space="preserve">AVT1 Abgabe </w:t>
                                       </w:r>
                                       <w:r>
                                         <w:rPr>
@@ -526,7 +506,6 @@
                                           <w:szCs w:val="28"/>
                                         </w:rPr>
                                       </w:pPr>
-                                      <w:proofErr w:type="spellStart"/>
                                       <w:r>
                                         <w:rPr>
                                           <w:rFonts w:ascii="Adobe Garamond Pro" w:hAnsi="Adobe Garamond Pro"/>
@@ -536,7 +515,6 @@
                                         </w:rPr>
                                         <w:t>Protokoll</w:t>
                                       </w:r>
-                                      <w:proofErr w:type="spellEnd"/>
                                     </w:p>
                                   </w:sdtContent>
                                 </w:sdt>
@@ -644,27 +622,7 @@
                                     <w:sz w:val="84"/>
                                     <w:szCs w:val="84"/>
                                   </w:rPr>
-                                  <w:t xml:space="preserve">AVT1 </w:t>
-                                </w:r>
-                                <w:proofErr w:type="spellStart"/>
-                                <w:r>
-                                  <w:rPr>
-                                    <w:rFonts w:ascii="Adobe Garamond Pro" w:eastAsiaTheme="majorEastAsia" w:hAnsi="Adobe Garamond Pro" w:cstheme="majorBidi"/>
-                                    <w:color w:val="FFFFFF" w:themeColor="background1"/>
-                                    <w:sz w:val="84"/>
-                                    <w:szCs w:val="84"/>
-                                  </w:rPr>
-                                  <w:t>Abgabe</w:t>
-                                </w:r>
-                                <w:proofErr w:type="spellEnd"/>
-                                <w:r>
-                                  <w:rPr>
-                                    <w:rFonts w:ascii="Adobe Garamond Pro" w:eastAsiaTheme="majorEastAsia" w:hAnsi="Adobe Garamond Pro" w:cstheme="majorBidi"/>
-                                    <w:color w:val="FFFFFF" w:themeColor="background1"/>
-                                    <w:sz w:val="84"/>
-                                    <w:szCs w:val="84"/>
-                                  </w:rPr>
-                                  <w:t xml:space="preserve"> </w:t>
+                                  <w:t xml:space="preserve">AVT1 Abgabe </w:t>
                                 </w:r>
                                 <w:r>
                                   <w:rPr>
@@ -703,7 +661,6 @@
                                     <w:szCs w:val="28"/>
                                   </w:rPr>
                                 </w:pPr>
-                                <w:proofErr w:type="spellStart"/>
                                 <w:r>
                                   <w:rPr>
                                     <w:rFonts w:ascii="Adobe Garamond Pro" w:hAnsi="Adobe Garamond Pro"/>
@@ -713,7 +670,6 @@
                                   </w:rPr>
                                   <w:t>Protokoll</w:t>
                                 </w:r>
-                                <w:proofErr w:type="spellEnd"/>
                               </w:p>
                             </w:sdtContent>
                           </w:sdt>
@@ -732,19 +688,2542 @@
     </w:p>
     <w:p>
       <w:pPr>
+        <w:pStyle w:val="Heading1"/>
+      </w:pPr>
+      <w:r>
+        <w:br w:type="page"/>
+      </w:r>
+      <w:r>
+        <w:lastRenderedPageBreak/>
+        <w:t>Frequenzspektrum</w:t>
+      </w:r>
+    </w:p>
+    <w:p>
+      <w:pPr>
+        <w:pStyle w:val="Heading2"/>
+      </w:pPr>
+      <w:r>
+        <w:t>1.1</w:t>
+      </w:r>
+    </w:p>
+    <w:p>
+      <w:pPr>
+        <w:pStyle w:val="Quote"/>
+      </w:pPr>
+      <w:r>
+        <w:t>Zuerst track 3, dann track 4 und schließlich beide tracks gleichzeitig aktivieren (unmute) und am frequency analyzer und am oscilloscope ablesen. Beschreiben Sie, was Sie dort beobachten und warum.</w:t>
+      </w:r>
+    </w:p>
+    <w:p>
+      <w:r>
+        <w:rPr>
+          <w:noProof/>
+        </w:rPr>
+        <mc:AlternateContent>
+          <mc:Choice Requires="wps">
+            <w:drawing>
+              <wp:anchor distT="0" distB="0" distL="114300" distR="114300" simplePos="0" relativeHeight="251699200" behindDoc="0" locked="0" layoutInCell="1" allowOverlap="1" wp14:anchorId="61B2BD14" wp14:editId="7A03698E">
+                <wp:simplePos x="0" y="0"/>
+                <wp:positionH relativeFrom="column">
+                  <wp:posOffset>829310</wp:posOffset>
+                </wp:positionH>
+                <wp:positionV relativeFrom="paragraph">
+                  <wp:posOffset>3456940</wp:posOffset>
+                </wp:positionV>
+                <wp:extent cx="3514725" cy="635"/>
+                <wp:effectExtent l="0" t="0" r="0" b="0"/>
+                <wp:wrapTopAndBottom/>
+                <wp:docPr id="569124019" name="Text Box 1"/>
+                <wp:cNvGraphicFramePr/>
+                <a:graphic xmlns:a="http://schemas.openxmlformats.org/drawingml/2006/main">
+                  <a:graphicData uri="http://schemas.microsoft.com/office/word/2010/wordprocessingShape">
+                    <wps:wsp>
+                      <wps:cNvSpPr txBox="1"/>
+                      <wps:spPr>
+                        <a:xfrm>
+                          <a:off x="0" y="0"/>
+                          <a:ext cx="3514725" cy="635"/>
+                        </a:xfrm>
+                        <a:prstGeom prst="rect">
+                          <a:avLst/>
+                        </a:prstGeom>
+                        <a:solidFill>
+                          <a:prstClr val="white"/>
+                        </a:solidFill>
+                        <a:ln>
+                          <a:noFill/>
+                        </a:ln>
+                      </wps:spPr>
+                      <wps:txbx>
+                        <w:txbxContent>
+                          <w:p>
+                            <w:pPr>
+                              <w:pStyle w:val="Caption"/>
+                            </w:pPr>
+                            <w:r>
+                              <w:t xml:space="preserve">Abbildung </w:t>
+                            </w:r>
+                            <w:r>
+                              <w:fldChar w:fldCharType="begin"/>
+                            </w:r>
+                            <w:r>
+                              <w:instrText xml:space="preserve"> SEQ Abbildung \* ARABIC </w:instrText>
+                            </w:r>
+                            <w:r>
+                              <w:fldChar w:fldCharType="separate"/>
+                            </w:r>
+                            <w:r>
+                              <w:rPr>
+                                <w:noProof/>
+                              </w:rPr>
+                              <w:t>1</w:t>
+                            </w:r>
+                            <w:r>
+                              <w:fldChar w:fldCharType="end"/>
+                            </w:r>
+                            <w:r>
+                              <w:t>: Track 3 Solo</w:t>
+                            </w:r>
+                          </w:p>
+                        </w:txbxContent>
+                      </wps:txbx>
+                      <wps:bodyPr rot="0" spcFirstLastPara="0" vertOverflow="overflow" horzOverflow="overflow" vert="horz" wrap="square" lIns="0" tIns="0" rIns="0" bIns="0" numCol="1" spcCol="0" rtlCol="0" fromWordArt="0" anchor="t" anchorCtr="0" forceAA="0" compatLnSpc="1">
+                        <a:prstTxWarp prst="textNoShape">
+                          <a:avLst/>
+                        </a:prstTxWarp>
+                        <a:spAutoFit/>
+                      </wps:bodyPr>
+                    </wps:wsp>
+                  </a:graphicData>
+                </a:graphic>
+              </wp:anchor>
+            </w:drawing>
+          </mc:Choice>
+          <mc:Fallback>
+            <w:pict>
+              <v:shape w14:anchorId="61B2BD14" id="Text Box 1" o:spid="_x0000_s1030" type="#_x0000_t202" style="position:absolute;left:0;text-align:left;margin-left:65.3pt;margin-top:272.2pt;width:276.75pt;height:.05pt;z-index:251699200;visibility:visible;mso-wrap-style:square;mso-wrap-distance-left:9pt;mso-wrap-distance-top:0;mso-wrap-distance-right:9pt;mso-wrap-distance-bottom:0;mso-position-horizontal:absolute;mso-position-horizontal-relative:text;mso-position-vertical:absolute;mso-position-vertical-relative:text;v-text-anchor:top" o:gfxdata="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" stroked="f">
+                <v:textbox style="mso-fit-shape-to-text:t" inset="0,0,0,0">
+                  <w:txbxContent>
+                    <w:p>
+                      <w:pPr>
+                        <w:pStyle w:val="Caption"/>
+                      </w:pPr>
+                      <w:r>
+                        <w:t xml:space="preserve">Abbildung </w:t>
+                      </w:r>
+                      <w:r>
+                        <w:fldChar w:fldCharType="begin"/>
+                      </w:r>
+                      <w:r>
+                        <w:instrText xml:space="preserve"> SEQ Abbildung \* ARABIC </w:instrText>
+                      </w:r>
+                      <w:r>
+                        <w:fldChar w:fldCharType="separate"/>
+                      </w:r>
+                      <w:r>
+                        <w:rPr>
+                          <w:noProof/>
+                        </w:rPr>
+                        <w:t>1</w:t>
+                      </w:r>
+                      <w:r>
+                        <w:fldChar w:fldCharType="end"/>
+                      </w:r>
+                      <w:r>
+                        <w:t>: Track 3 Solo</w:t>
+                      </w:r>
+                    </w:p>
+                  </w:txbxContent>
+                </v:textbox>
+                <w10:wrap type="topAndBottom"/>
+              </v:shape>
+            </w:pict>
+          </mc:Fallback>
+        </mc:AlternateContent>
+      </w:r>
+      <w:r>
+        <w:drawing>
+          <wp:anchor distT="0" distB="0" distL="114300" distR="114300" simplePos="0" relativeHeight="251697152" behindDoc="0" locked="0" layoutInCell="1" allowOverlap="1" wp14:anchorId="2C2D2D04" wp14:editId="74C86F92">
+            <wp:simplePos x="0" y="0"/>
+            <wp:positionH relativeFrom="margin">
+              <wp:align>center</wp:align>
+            </wp:positionH>
+            <wp:positionV relativeFrom="paragraph">
+              <wp:posOffset>262077</wp:posOffset>
+            </wp:positionV>
+            <wp:extent cx="3514725" cy="3138170"/>
+            <wp:effectExtent l="0" t="0" r="9525" b="5080"/>
+            <wp:wrapTopAndBottom/>
+            <wp:docPr id="1391678324" name="Picture 1" descr="A screenshot of a computer&#10;&#10;AI-generated content may be incorrect."/>
+            <wp:cNvGraphicFramePr>
+              <a:graphicFrameLocks xmlns:a="http://schemas.openxmlformats.org/drawingml/2006/main" noChangeAspect="1"/>
+            </wp:cNvGraphicFramePr>
+            <a:graphic xmlns:a="http://schemas.openxmlformats.org/drawingml/2006/main">
+              <a:graphicData uri="http://schemas.openxmlformats.org/drawingml/2006/picture">
+                <pic:pic xmlns:pic="http://schemas.openxmlformats.org/drawingml/2006/picture">
+                  <pic:nvPicPr>
+                    <pic:cNvPr id="1391678324" name="Picture 1" descr="A screenshot of a computer&#10;&#10;AI-generated content may be incorrect."/>
+                    <pic:cNvPicPr/>
+                  </pic:nvPicPr>
+                  <pic:blipFill>
+                    <a:blip r:embed="rId8" cstate="print">
+                      <a:extLst>
+                        <a:ext uri="{28A0092B-C50C-407E-A947-70E740481C1C}">
+                          <a14:useLocalDpi xmlns:a14="http://schemas.microsoft.com/office/drawing/2010/main" val="0"/>
+                        </a:ext>
+                      </a:extLst>
+                    </a:blip>
+                    <a:stretch>
+                      <a:fillRect/>
+                    </a:stretch>
+                  </pic:blipFill>
+                  <pic:spPr>
+                    <a:xfrm>
+                      <a:off x="0" y="0"/>
+                      <a:ext cx="3514725" cy="3138170"/>
+                    </a:xfrm>
+                    <a:prstGeom prst="rect">
+                      <a:avLst/>
+                    </a:prstGeom>
+                  </pic:spPr>
+                </pic:pic>
+              </a:graphicData>
+            </a:graphic>
+            <wp14:sizeRelH relativeFrom="margin">
+              <wp14:pctWidth>0</wp14:pctWidth>
+            </wp14:sizeRelH>
+            <wp14:sizeRelV relativeFrom="margin">
+              <wp14:pctHeight>0</wp14:pctHeight>
+            </wp14:sizeRelV>
+          </wp:anchor>
+        </w:drawing>
+      </w:r>
+    </w:p>
+    <w:p>
+      <w:r>
+        <w:t>Track 3 erzeugt eine Sinu</w:t>
+      </w:r>
+      <w:r>
+        <w:t xml:space="preserve">swelle </w:t>
+      </w:r>
+      <w:r>
+        <w:t>m</w:t>
+      </w:r>
+      <w:r>
+        <w:t xml:space="preserve">it 440 kHz. Im </w:t>
+      </w:r>
+      <w:r>
+        <w:t>Oszilloskop</w:t>
+      </w:r>
+      <w:r>
+        <w:t xml:space="preserve"> </w:t>
+      </w:r>
+      <w:r>
+        <w:t>sieht man eine einfache Sinus</w:t>
+      </w:r>
+      <w:r>
+        <w:t>welle</w:t>
+      </w:r>
+      <w:r>
+        <w:t xml:space="preserve"> und im Frequency Spectrum Analyzer ist ein Spike bei 440 kHz.</w:t>
+      </w:r>
+      <w:r>
+        <w:t xml:space="preserve"> </w:t>
+      </w:r>
+    </w:p>
+    <w:p/>
+    <w:p/>
+    <w:p>
+      <w:r>
+        <w:lastRenderedPageBreak/>
+        <w:drawing>
+          <wp:anchor distT="0" distB="0" distL="114300" distR="114300" simplePos="0" relativeHeight="251700224" behindDoc="0" locked="0" layoutInCell="1" allowOverlap="1" wp14:anchorId="15952C54" wp14:editId="60EADF63">
+            <wp:simplePos x="0" y="0"/>
+            <wp:positionH relativeFrom="margin">
+              <wp:posOffset>929005</wp:posOffset>
+            </wp:positionH>
+            <wp:positionV relativeFrom="paragraph">
+              <wp:posOffset>0</wp:posOffset>
+            </wp:positionV>
+            <wp:extent cx="3328035" cy="2843530"/>
+            <wp:effectExtent l="0" t="0" r="5715" b="0"/>
+            <wp:wrapTopAndBottom/>
+            <wp:docPr id="517533347" name="Picture 1" descr="A screenshot of a computer&#10;&#10;AI-generated content may be incorrect."/>
+            <wp:cNvGraphicFramePr>
+              <a:graphicFrameLocks xmlns:a="http://schemas.openxmlformats.org/drawingml/2006/main" noChangeAspect="1"/>
+            </wp:cNvGraphicFramePr>
+            <a:graphic xmlns:a="http://schemas.openxmlformats.org/drawingml/2006/main">
+              <a:graphicData uri="http://schemas.openxmlformats.org/drawingml/2006/picture">
+                <pic:pic xmlns:pic="http://schemas.openxmlformats.org/drawingml/2006/picture">
+                  <pic:nvPicPr>
+                    <pic:cNvPr id="517533347" name="Picture 1" descr="A screenshot of a computer&#10;&#10;AI-generated content may be incorrect."/>
+                    <pic:cNvPicPr/>
+                  </pic:nvPicPr>
+                  <pic:blipFill>
+                    <a:blip r:embed="rId9" cstate="print">
+                      <a:extLst>
+                        <a:ext uri="{28A0092B-C50C-407E-A947-70E740481C1C}">
+                          <a14:useLocalDpi xmlns:a14="http://schemas.microsoft.com/office/drawing/2010/main" val="0"/>
+                        </a:ext>
+                      </a:extLst>
+                    </a:blip>
+                    <a:stretch>
+                      <a:fillRect/>
+                    </a:stretch>
+                  </pic:blipFill>
+                  <pic:spPr>
+                    <a:xfrm>
+                      <a:off x="0" y="0"/>
+                      <a:ext cx="3328035" cy="2843530"/>
+                    </a:xfrm>
+                    <a:prstGeom prst="rect">
+                      <a:avLst/>
+                    </a:prstGeom>
+                  </pic:spPr>
+                </pic:pic>
+              </a:graphicData>
+            </a:graphic>
+            <wp14:sizeRelH relativeFrom="margin">
+              <wp14:pctWidth>0</wp14:pctWidth>
+            </wp14:sizeRelH>
+            <wp14:sizeRelV relativeFrom="margin">
+              <wp14:pctHeight>0</wp14:pctHeight>
+            </wp14:sizeRelV>
+          </wp:anchor>
+        </w:drawing>
+      </w:r>
+      <w:r>
+        <w:rPr>
+          <w:noProof/>
+        </w:rPr>
+        <mc:AlternateContent>
+          <mc:Choice Requires="wps">
+            <w:drawing>
+              <wp:anchor distT="0" distB="0" distL="114300" distR="114300" simplePos="0" relativeHeight="251702272" behindDoc="0" locked="0" layoutInCell="1" allowOverlap="1" wp14:anchorId="39CFA813" wp14:editId="446E806B">
+                <wp:simplePos x="0" y="0"/>
+                <wp:positionH relativeFrom="column">
+                  <wp:posOffset>929030</wp:posOffset>
+                </wp:positionH>
+                <wp:positionV relativeFrom="paragraph">
+                  <wp:posOffset>2859963</wp:posOffset>
+                </wp:positionV>
+                <wp:extent cx="3328035" cy="635"/>
+                <wp:effectExtent l="0" t="0" r="0" b="0"/>
+                <wp:wrapTopAndBottom/>
+                <wp:docPr id="2004242826" name="Text Box 1"/>
+                <wp:cNvGraphicFramePr/>
+                <a:graphic xmlns:a="http://schemas.openxmlformats.org/drawingml/2006/main">
+                  <a:graphicData uri="http://schemas.microsoft.com/office/word/2010/wordprocessingShape">
+                    <wps:wsp>
+                      <wps:cNvSpPr txBox="1"/>
+                      <wps:spPr>
+                        <a:xfrm>
+                          <a:off x="0" y="0"/>
+                          <a:ext cx="3328035" cy="635"/>
+                        </a:xfrm>
+                        <a:prstGeom prst="rect">
+                          <a:avLst/>
+                        </a:prstGeom>
+                        <a:solidFill>
+                          <a:prstClr val="white"/>
+                        </a:solidFill>
+                        <a:ln>
+                          <a:noFill/>
+                        </a:ln>
+                      </wps:spPr>
+                      <wps:txbx>
+                        <w:txbxContent>
+                          <w:p>
+                            <w:pPr>
+                              <w:pStyle w:val="Caption"/>
+                            </w:pPr>
+                            <w:r>
+                              <w:t xml:space="preserve">Abbildung </w:t>
+                            </w:r>
+                            <w:r>
+                              <w:fldChar w:fldCharType="begin"/>
+                            </w:r>
+                            <w:r>
+                              <w:instrText xml:space="preserve"> SEQ Abbildung \* ARABIC </w:instrText>
+                            </w:r>
+                            <w:r>
+                              <w:fldChar w:fldCharType="separate"/>
+                            </w:r>
+                            <w:r>
+                              <w:rPr>
+                                <w:noProof/>
+                              </w:rPr>
+                              <w:t>2</w:t>
+                            </w:r>
+                            <w:r>
+                              <w:fldChar w:fldCharType="end"/>
+                            </w:r>
+                            <w:r>
+                              <w:t>: Track 4 Solo</w:t>
+                            </w:r>
+                          </w:p>
+                        </w:txbxContent>
+                      </wps:txbx>
+                      <wps:bodyPr rot="0" spcFirstLastPara="0" vertOverflow="overflow" horzOverflow="overflow" vert="horz" wrap="square" lIns="0" tIns="0" rIns="0" bIns="0" numCol="1" spcCol="0" rtlCol="0" fromWordArt="0" anchor="t" anchorCtr="0" forceAA="0" compatLnSpc="1">
+                        <a:prstTxWarp prst="textNoShape">
+                          <a:avLst/>
+                        </a:prstTxWarp>
+                        <a:spAutoFit/>
+                      </wps:bodyPr>
+                    </wps:wsp>
+                  </a:graphicData>
+                </a:graphic>
+              </wp:anchor>
+            </w:drawing>
+          </mc:Choice>
+          <mc:Fallback>
+            <w:pict>
+              <v:shape w14:anchorId="39CFA813" id="_x0000_s1031" type="#_x0000_t202" style="position:absolute;left:0;text-align:left;margin-left:73.15pt;margin-top:225.2pt;width:262.05pt;height:.05pt;z-index:251702272;visibility:visible;mso-wrap-style:square;mso-wrap-distance-left:9pt;mso-wrap-distance-top:0;mso-wrap-distance-right:9pt;mso-wrap-distance-bottom:0;mso-position-horizontal:absolute;mso-position-horizontal-relative:text;mso-position-vertical:absolute;mso-position-vertical-relative:text;v-text-anchor:top" o:gfxdata="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" stroked="f">
+                <v:textbox style="mso-fit-shape-to-text:t" inset="0,0,0,0">
+                  <w:txbxContent>
+                    <w:p>
+                      <w:pPr>
+                        <w:pStyle w:val="Caption"/>
+                      </w:pPr>
+                      <w:r>
+                        <w:t xml:space="preserve">Abbildung </w:t>
+                      </w:r>
+                      <w:r>
+                        <w:fldChar w:fldCharType="begin"/>
+                      </w:r>
+                      <w:r>
+                        <w:instrText xml:space="preserve"> SEQ Abbildung \* ARABIC </w:instrText>
+                      </w:r>
+                      <w:r>
+                        <w:fldChar w:fldCharType="separate"/>
+                      </w:r>
+                      <w:r>
+                        <w:rPr>
+                          <w:noProof/>
+                        </w:rPr>
+                        <w:t>2</w:t>
+                      </w:r>
+                      <w:r>
+                        <w:fldChar w:fldCharType="end"/>
+                      </w:r>
+                      <w:r>
+                        <w:t>: Track 4 Solo</w:t>
+                      </w:r>
+                    </w:p>
+                  </w:txbxContent>
+                </v:textbox>
+                <w10:wrap type="topAndBottom"/>
+              </v:shape>
+            </w:pict>
+          </mc:Fallback>
+        </mc:AlternateContent>
+      </w:r>
+      <w:r>
+        <w:t xml:space="preserve">Track 4 erzeugt wie Track 3 eine Sinuswelle, aber mit 880kHz. </w:t>
+      </w:r>
+    </w:p>
+    <w:p>
+      <w:r>
+        <w:rPr>
+          <w:noProof/>
+        </w:rPr>
+        <mc:AlternateContent>
+          <mc:Choice Requires="wps">
+            <w:drawing>
+              <wp:anchor distT="0" distB="0" distL="114300" distR="114300" simplePos="0" relativeHeight="251705344" behindDoc="0" locked="0" layoutInCell="1" allowOverlap="1" wp14:anchorId="3DAEBDFC" wp14:editId="564848E1">
+                <wp:simplePos x="0" y="0"/>
+                <wp:positionH relativeFrom="column">
+                  <wp:posOffset>1000760</wp:posOffset>
+                </wp:positionH>
+                <wp:positionV relativeFrom="paragraph">
+                  <wp:posOffset>3395980</wp:posOffset>
+                </wp:positionV>
+                <wp:extent cx="3171825" cy="635"/>
+                <wp:effectExtent l="0" t="0" r="0" b="0"/>
+                <wp:wrapTopAndBottom/>
+                <wp:docPr id="1683674214" name="Text Box 1"/>
+                <wp:cNvGraphicFramePr/>
+                <a:graphic xmlns:a="http://schemas.openxmlformats.org/drawingml/2006/main">
+                  <a:graphicData uri="http://schemas.microsoft.com/office/word/2010/wordprocessingShape">
+                    <wps:wsp>
+                      <wps:cNvSpPr txBox="1"/>
+                      <wps:spPr>
+                        <a:xfrm>
+                          <a:off x="0" y="0"/>
+                          <a:ext cx="3171825" cy="635"/>
+                        </a:xfrm>
+                        <a:prstGeom prst="rect">
+                          <a:avLst/>
+                        </a:prstGeom>
+                        <a:solidFill>
+                          <a:prstClr val="white"/>
+                        </a:solidFill>
+                        <a:ln>
+                          <a:noFill/>
+                        </a:ln>
+                      </wps:spPr>
+                      <wps:txbx>
+                        <w:txbxContent>
+                          <w:p>
+                            <w:pPr>
+                              <w:pStyle w:val="Caption"/>
+                            </w:pPr>
+                            <w:r>
+                              <w:t xml:space="preserve">Abbildung </w:t>
+                            </w:r>
+                            <w:r>
+                              <w:fldChar w:fldCharType="begin"/>
+                            </w:r>
+                            <w:r>
+                              <w:instrText xml:space="preserve"> SEQ Abbildung \* ARABIC </w:instrText>
+                            </w:r>
+                            <w:r>
+                              <w:fldChar w:fldCharType="separate"/>
+                            </w:r>
+                            <w:r>
+                              <w:rPr>
+                                <w:noProof/>
+                              </w:rPr>
+                              <w:t>3</w:t>
+                            </w:r>
+                            <w:r>
+                              <w:fldChar w:fldCharType="end"/>
+                            </w:r>
+                            <w:r>
+                              <w:t>: Track 3 und Track 4 gemeinsam</w:t>
+                            </w:r>
+                          </w:p>
+                        </w:txbxContent>
+                      </wps:txbx>
+                      <wps:bodyPr rot="0" spcFirstLastPara="0" vertOverflow="overflow" horzOverflow="overflow" vert="horz" wrap="square" lIns="0" tIns="0" rIns="0" bIns="0" numCol="1" spcCol="0" rtlCol="0" fromWordArt="0" anchor="t" anchorCtr="0" forceAA="0" compatLnSpc="1">
+                        <a:prstTxWarp prst="textNoShape">
+                          <a:avLst/>
+                        </a:prstTxWarp>
+                        <a:spAutoFit/>
+                      </wps:bodyPr>
+                    </wps:wsp>
+                  </a:graphicData>
+                </a:graphic>
+              </wp:anchor>
+            </w:drawing>
+          </mc:Choice>
+          <mc:Fallback>
+            <w:pict>
+              <v:shape w14:anchorId="3DAEBDFC" id="_x0000_s1032" type="#_x0000_t202" style="position:absolute;left:0;text-align:left;margin-left:78.8pt;margin-top:267.4pt;width:249.75pt;height:.05pt;z-index:251705344;visibility:visible;mso-wrap-style:square;mso-wrap-distance-left:9pt;mso-wrap-distance-top:0;mso-wrap-distance-right:9pt;mso-wrap-distance-bottom:0;mso-position-horizontal:absolute;mso-position-horizontal-relative:text;mso-position-vertical:absolute;mso-position-vertical-relative:text;v-text-anchor:top" o:gfxdata="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" stroked="f">
+                <v:textbox style="mso-fit-shape-to-text:t" inset="0,0,0,0">
+                  <w:txbxContent>
+                    <w:p>
+                      <w:pPr>
+                        <w:pStyle w:val="Caption"/>
+                      </w:pPr>
+                      <w:r>
+                        <w:t xml:space="preserve">Abbildung </w:t>
+                      </w:r>
+                      <w:r>
+                        <w:fldChar w:fldCharType="begin"/>
+                      </w:r>
+                      <w:r>
+                        <w:instrText xml:space="preserve"> SEQ Abbildung \* ARABIC </w:instrText>
+                      </w:r>
+                      <w:r>
+                        <w:fldChar w:fldCharType="separate"/>
+                      </w:r>
+                      <w:r>
+                        <w:rPr>
+                          <w:noProof/>
+                        </w:rPr>
+                        <w:t>3</w:t>
+                      </w:r>
+                      <w:r>
+                        <w:fldChar w:fldCharType="end"/>
+                      </w:r>
+                      <w:r>
+                        <w:t>: Track 3 und Track 4 gemeinsam</w:t>
+                      </w:r>
+                    </w:p>
+                  </w:txbxContent>
+                </v:textbox>
+                <w10:wrap type="topAndBottom"/>
+              </v:shape>
+            </w:pict>
+          </mc:Fallback>
+        </mc:AlternateContent>
+      </w:r>
+      <w:r>
+        <w:drawing>
+          <wp:anchor distT="0" distB="0" distL="114300" distR="114300" simplePos="0" relativeHeight="251703296" behindDoc="0" locked="0" layoutInCell="1" allowOverlap="1" wp14:anchorId="39C8EE9E" wp14:editId="4EF30F39">
+            <wp:simplePos x="0" y="0"/>
+            <wp:positionH relativeFrom="margin">
+              <wp:align>center</wp:align>
+            </wp:positionH>
+            <wp:positionV relativeFrom="paragraph">
+              <wp:posOffset>186131</wp:posOffset>
+            </wp:positionV>
+            <wp:extent cx="3171825" cy="3152775"/>
+            <wp:effectExtent l="0" t="0" r="9525" b="9525"/>
+            <wp:wrapTopAndBottom/>
+            <wp:docPr id="1726065632" name="Picture 1" descr="A screenshot of a computer&#10;&#10;AI-generated content may be incorrect."/>
+            <wp:cNvGraphicFramePr>
+              <a:graphicFrameLocks xmlns:a="http://schemas.openxmlformats.org/drawingml/2006/main" noChangeAspect="1"/>
+            </wp:cNvGraphicFramePr>
+            <a:graphic xmlns:a="http://schemas.openxmlformats.org/drawingml/2006/main">
+              <a:graphicData uri="http://schemas.openxmlformats.org/drawingml/2006/picture">
+                <pic:pic xmlns:pic="http://schemas.openxmlformats.org/drawingml/2006/picture">
+                  <pic:nvPicPr>
+                    <pic:cNvPr id="1726065632" name="Picture 1" descr="A screenshot of a computer&#10;&#10;AI-generated content may be incorrect."/>
+                    <pic:cNvPicPr/>
+                  </pic:nvPicPr>
+                  <pic:blipFill>
+                    <a:blip r:embed="rId10" cstate="print">
+                      <a:extLst>
+                        <a:ext uri="{28A0092B-C50C-407E-A947-70E740481C1C}">
+                          <a14:useLocalDpi xmlns:a14="http://schemas.microsoft.com/office/drawing/2010/main" val="0"/>
+                        </a:ext>
+                      </a:extLst>
+                    </a:blip>
+                    <a:stretch>
+                      <a:fillRect/>
+                    </a:stretch>
+                  </pic:blipFill>
+                  <pic:spPr>
+                    <a:xfrm>
+                      <a:off x="0" y="0"/>
+                      <a:ext cx="3171825" cy="3152775"/>
+                    </a:xfrm>
+                    <a:prstGeom prst="rect">
+                      <a:avLst/>
+                    </a:prstGeom>
+                  </pic:spPr>
+                </pic:pic>
+              </a:graphicData>
+            </a:graphic>
+            <wp14:sizeRelH relativeFrom="margin">
+              <wp14:pctWidth>0</wp14:pctWidth>
+            </wp14:sizeRelH>
+            <wp14:sizeRelV relativeFrom="margin">
+              <wp14:pctHeight>0</wp14:pctHeight>
+            </wp14:sizeRelV>
+          </wp:anchor>
+        </w:drawing>
+      </w:r>
+      <w:r>
+        <w:t xml:space="preserve">Die 440 kHz und die 880 kHz Sinuswellen überlagern sich. Dies sieht man </w:t>
+      </w:r>
+      <w:r>
+        <w:t>deutlich</w:t>
+      </w:r>
+      <w:r>
+        <w:t xml:space="preserve"> im </w:t>
+      </w:r>
+      <w:r>
+        <w:t>Oszilloskop</w:t>
+      </w:r>
+      <w:r>
+        <w:t>. Im Frequency Spectrum Analyzer sieht man jetzt zwei Spikes, bei 440 und 880 kHz.</w:t>
+      </w:r>
+    </w:p>
+    <w:p>
+      <w:pPr>
+        <w:pStyle w:val="Heading2"/>
+      </w:pPr>
+      <w:r>
+        <w:lastRenderedPageBreak/>
+        <w:t>1.2</w:t>
+      </w:r>
+    </w:p>
+    <w:p>
+      <w:pPr>
+        <w:pStyle w:val="Quote"/>
+      </w:pPr>
+      <w:r>
+        <w:t>Track 3 und 4 offen lassen. Auf track 4 im time adjustment delay (über FX button öffnen) die Phase der Sinusschwingung in Schritten von 1000 samples verschieben. Verändert sich die überlagerte Wellenform? Verändert sich die Spektralanalyse?</w:t>
+      </w:r>
+    </w:p>
+    <w:p>
+      <w:r>
+        <w:rPr>
+          <w:noProof/>
+        </w:rPr>
+        <mc:AlternateContent>
+          <mc:Choice Requires="wps">
+            <w:drawing>
+              <wp:anchor distT="0" distB="0" distL="114300" distR="114300" simplePos="0" relativeHeight="251708416" behindDoc="0" locked="0" layoutInCell="1" allowOverlap="1" wp14:anchorId="56CF44E3" wp14:editId="65ECF225">
+                <wp:simplePos x="0" y="0"/>
+                <wp:positionH relativeFrom="column">
+                  <wp:posOffset>810260</wp:posOffset>
+                </wp:positionH>
+                <wp:positionV relativeFrom="paragraph">
+                  <wp:posOffset>3319145</wp:posOffset>
+                </wp:positionV>
+                <wp:extent cx="3556000" cy="635"/>
+                <wp:effectExtent l="0" t="0" r="0" b="0"/>
+                <wp:wrapTopAndBottom/>
+                <wp:docPr id="341518308" name="Text Box 1"/>
+                <wp:cNvGraphicFramePr/>
+                <a:graphic xmlns:a="http://schemas.openxmlformats.org/drawingml/2006/main">
+                  <a:graphicData uri="http://schemas.microsoft.com/office/word/2010/wordprocessingShape">
+                    <wps:wsp>
+                      <wps:cNvSpPr txBox="1"/>
+                      <wps:spPr>
+                        <a:xfrm>
+                          <a:off x="0" y="0"/>
+                          <a:ext cx="3556000" cy="635"/>
+                        </a:xfrm>
+                        <a:prstGeom prst="rect">
+                          <a:avLst/>
+                        </a:prstGeom>
+                        <a:solidFill>
+                          <a:prstClr val="white"/>
+                        </a:solidFill>
+                        <a:ln>
+                          <a:noFill/>
+                        </a:ln>
+                      </wps:spPr>
+                      <wps:txbx>
+                        <w:txbxContent>
+                          <w:p>
+                            <w:pPr>
+                              <w:pStyle w:val="Caption"/>
+                            </w:pPr>
+                            <w:r>
+                              <w:t xml:space="preserve">Abbildung </w:t>
+                            </w:r>
+                            <w:r>
+                              <w:fldChar w:fldCharType="begin"/>
+                            </w:r>
+                            <w:r>
+                              <w:instrText xml:space="preserve"> SEQ Abbildung \* ARABIC </w:instrText>
+                            </w:r>
+                            <w:r>
+                              <w:fldChar w:fldCharType="separate"/>
+                            </w:r>
+                            <w:r>
+                              <w:rPr>
+                                <w:noProof/>
+                              </w:rPr>
+                              <w:t>4</w:t>
+                            </w:r>
+                            <w:r>
+                              <w:fldChar w:fldCharType="end"/>
+                            </w:r>
+                            <w:r>
+                              <w:t>: 1000 Sample Delay Track 4</w:t>
+                            </w:r>
+                          </w:p>
+                        </w:txbxContent>
+                      </wps:txbx>
+                      <wps:bodyPr rot="0" spcFirstLastPara="0" vertOverflow="overflow" horzOverflow="overflow" vert="horz" wrap="square" lIns="0" tIns="0" rIns="0" bIns="0" numCol="1" spcCol="0" rtlCol="0" fromWordArt="0" anchor="t" anchorCtr="0" forceAA="0" compatLnSpc="1">
+                        <a:prstTxWarp prst="textNoShape">
+                          <a:avLst/>
+                        </a:prstTxWarp>
+                        <a:spAutoFit/>
+                      </wps:bodyPr>
+                    </wps:wsp>
+                  </a:graphicData>
+                </a:graphic>
+              </wp:anchor>
+            </w:drawing>
+          </mc:Choice>
+          <mc:Fallback>
+            <w:pict>
+              <v:shape w14:anchorId="56CF44E3" id="_x0000_s1033" type="#_x0000_t202" style="position:absolute;left:0;text-align:left;margin-left:63.8pt;margin-top:261.35pt;width:280pt;height:.05pt;z-index:251708416;visibility:visible;mso-wrap-style:square;mso-wrap-distance-left:9pt;mso-wrap-distance-top:0;mso-wrap-distance-right:9pt;mso-wrap-distance-bottom:0;mso-position-horizontal:absolute;mso-position-horizontal-relative:text;mso-position-vertical:absolute;mso-position-vertical-relative:text;v-text-anchor:top" o:gfxdata="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" stroked="f">
+                <v:textbox style="mso-fit-shape-to-text:t" inset="0,0,0,0">
+                  <w:txbxContent>
+                    <w:p>
+                      <w:pPr>
+                        <w:pStyle w:val="Caption"/>
+                      </w:pPr>
+                      <w:r>
+                        <w:t xml:space="preserve">Abbildung </w:t>
+                      </w:r>
+                      <w:r>
+                        <w:fldChar w:fldCharType="begin"/>
+                      </w:r>
+                      <w:r>
+                        <w:instrText xml:space="preserve"> SEQ Abbildung \* ARABIC </w:instrText>
+                      </w:r>
+                      <w:r>
+                        <w:fldChar w:fldCharType="separate"/>
+                      </w:r>
+                      <w:r>
+                        <w:rPr>
+                          <w:noProof/>
+                        </w:rPr>
+                        <w:t>4</w:t>
+                      </w:r>
+                      <w:r>
+                        <w:fldChar w:fldCharType="end"/>
+                      </w:r>
+                      <w:r>
+                        <w:t>: 1000 Sample Delay Track 4</w:t>
+                      </w:r>
+                    </w:p>
+                  </w:txbxContent>
+                </v:textbox>
+                <w10:wrap type="topAndBottom"/>
+              </v:shape>
+            </w:pict>
+          </mc:Fallback>
+        </mc:AlternateContent>
+      </w:r>
+      <w:r>
+        <w:drawing>
+          <wp:anchor distT="0" distB="0" distL="114300" distR="114300" simplePos="0" relativeHeight="251706368" behindDoc="0" locked="0" layoutInCell="1" allowOverlap="1" wp14:anchorId="7CEADC55" wp14:editId="3F883196">
+            <wp:simplePos x="0" y="0"/>
+            <wp:positionH relativeFrom="margin">
+              <wp:align>center</wp:align>
+            </wp:positionH>
+            <wp:positionV relativeFrom="paragraph">
+              <wp:posOffset>300304</wp:posOffset>
+            </wp:positionV>
+            <wp:extent cx="3556000" cy="2962275"/>
+            <wp:effectExtent l="0" t="0" r="6350" b="9525"/>
+            <wp:wrapTopAndBottom/>
+            <wp:docPr id="872763995" name="Picture 1" descr="A screenshot of a computer&#10;&#10;AI-generated content may be incorrect."/>
+            <wp:cNvGraphicFramePr>
+              <a:graphicFrameLocks xmlns:a="http://schemas.openxmlformats.org/drawingml/2006/main" noChangeAspect="1"/>
+            </wp:cNvGraphicFramePr>
+            <a:graphic xmlns:a="http://schemas.openxmlformats.org/drawingml/2006/main">
+              <a:graphicData uri="http://schemas.openxmlformats.org/drawingml/2006/picture">
+                <pic:pic xmlns:pic="http://schemas.openxmlformats.org/drawingml/2006/picture">
+                  <pic:nvPicPr>
+                    <pic:cNvPr id="872763995" name="Picture 1" descr="A screenshot of a computer&#10;&#10;AI-generated content may be incorrect."/>
+                    <pic:cNvPicPr/>
+                  </pic:nvPicPr>
+                  <pic:blipFill>
+                    <a:blip r:embed="rId11" cstate="print">
+                      <a:extLst>
+                        <a:ext uri="{28A0092B-C50C-407E-A947-70E740481C1C}">
+                          <a14:useLocalDpi xmlns:a14="http://schemas.microsoft.com/office/drawing/2010/main" val="0"/>
+                        </a:ext>
+                      </a:extLst>
+                    </a:blip>
+                    <a:stretch>
+                      <a:fillRect/>
+                    </a:stretch>
+                  </pic:blipFill>
+                  <pic:spPr>
+                    <a:xfrm>
+                      <a:off x="0" y="0"/>
+                      <a:ext cx="3556000" cy="2962275"/>
+                    </a:xfrm>
+                    <a:prstGeom prst="rect">
+                      <a:avLst/>
+                    </a:prstGeom>
+                  </pic:spPr>
+                </pic:pic>
+              </a:graphicData>
+            </a:graphic>
+            <wp14:sizeRelH relativeFrom="margin">
+              <wp14:pctWidth>0</wp14:pctWidth>
+            </wp14:sizeRelH>
+            <wp14:sizeRelV relativeFrom="margin">
+              <wp14:pctHeight>0</wp14:pctHeight>
+            </wp14:sizeRelV>
+          </wp:anchor>
+        </w:drawing>
+      </w:r>
+    </w:p>
+    <w:p>
+      <w:r>
+        <w:t xml:space="preserve">Die Phasenverschiebung in Track 4 erkennt man im </w:t>
+      </w:r>
+      <w:r>
+        <w:t>Oszilloskop</w:t>
+      </w:r>
+      <w:r>
+        <w:t>, jedoch im Frequency Spectrum Analyzer ist keine Veränderung erkennbar. Dies ist, weil durch Forier-Transform, der Zeitfaktor verschwindet.</w:t>
+      </w:r>
+    </w:p>
+    <w:p>
+      <w:pPr>
+        <w:pStyle w:val="Heading2"/>
+      </w:pPr>
+      <w:r>
+        <w:t>1.3</w:t>
+      </w:r>
+    </w:p>
+    <w:p>
+      <w:pPr>
+        <w:pStyle w:val="Quote"/>
+      </w:pPr>
+      <w:r>
+        <w:t>Track 5 unmuten und track 3 und 4 muten. Stellen Sie das Signal im tone generator zwischen triangle und saw um. Was sehen Sie am Oszilloskop? Wie unterscheiden sich die Obertöne (Fourierreihen) der beiden Signale?</w:t>
+      </w:r>
+    </w:p>
+    <w:p>
+      <w:r>
+        <w:lastRenderedPageBreak/>
+        <w:drawing>
+          <wp:anchor distT="0" distB="0" distL="114300" distR="114300" simplePos="0" relativeHeight="251709440" behindDoc="0" locked="0" layoutInCell="1" allowOverlap="1" wp14:anchorId="2A3F8AF0" wp14:editId="489CC700">
+            <wp:simplePos x="0" y="0"/>
+            <wp:positionH relativeFrom="column">
+              <wp:posOffset>1489075</wp:posOffset>
+            </wp:positionH>
+            <wp:positionV relativeFrom="paragraph">
+              <wp:posOffset>635</wp:posOffset>
+            </wp:positionV>
+            <wp:extent cx="2957195" cy="2451735"/>
+            <wp:effectExtent l="0" t="0" r="0" b="5715"/>
+            <wp:wrapTopAndBottom/>
+            <wp:docPr id="1638926191" name="Picture 1" descr="A screenshot of a computer&#10;&#10;AI-generated content may be incorrect."/>
+            <wp:cNvGraphicFramePr>
+              <a:graphicFrameLocks xmlns:a="http://schemas.openxmlformats.org/drawingml/2006/main" noChangeAspect="1"/>
+            </wp:cNvGraphicFramePr>
+            <a:graphic xmlns:a="http://schemas.openxmlformats.org/drawingml/2006/main">
+              <a:graphicData uri="http://schemas.openxmlformats.org/drawingml/2006/picture">
+                <pic:pic xmlns:pic="http://schemas.openxmlformats.org/drawingml/2006/picture">
+                  <pic:nvPicPr>
+                    <pic:cNvPr id="1638926191" name="Picture 1" descr="A screenshot of a computer&#10;&#10;AI-generated content may be incorrect."/>
+                    <pic:cNvPicPr/>
+                  </pic:nvPicPr>
+                  <pic:blipFill>
+                    <a:blip r:embed="rId12" cstate="print">
+                      <a:extLst>
+                        <a:ext uri="{28A0092B-C50C-407E-A947-70E740481C1C}">
+                          <a14:useLocalDpi xmlns:a14="http://schemas.microsoft.com/office/drawing/2010/main" val="0"/>
+                        </a:ext>
+                      </a:extLst>
+                    </a:blip>
+                    <a:stretch>
+                      <a:fillRect/>
+                    </a:stretch>
+                  </pic:blipFill>
+                  <pic:spPr>
+                    <a:xfrm>
+                      <a:off x="0" y="0"/>
+                      <a:ext cx="2957195" cy="2451735"/>
+                    </a:xfrm>
+                    <a:prstGeom prst="rect">
+                      <a:avLst/>
+                    </a:prstGeom>
+                  </pic:spPr>
+                </pic:pic>
+              </a:graphicData>
+            </a:graphic>
+            <wp14:sizeRelH relativeFrom="margin">
+              <wp14:pctWidth>0</wp14:pctWidth>
+            </wp14:sizeRelH>
+            <wp14:sizeRelV relativeFrom="margin">
+              <wp14:pctHeight>0</wp14:pctHeight>
+            </wp14:sizeRelV>
+          </wp:anchor>
+        </w:drawing>
+      </w:r>
+      <w:r>
+        <w:rPr>
+          <w:noProof/>
+        </w:rPr>
+        <mc:AlternateContent>
+          <mc:Choice Requires="wps">
+            <w:drawing>
+              <wp:anchor distT="0" distB="0" distL="114300" distR="114300" simplePos="0" relativeHeight="251714560" behindDoc="0" locked="0" layoutInCell="1" allowOverlap="1" wp14:anchorId="250ECD14" wp14:editId="238E3B6F">
+                <wp:simplePos x="0" y="0"/>
+                <wp:positionH relativeFrom="column">
+                  <wp:posOffset>1536700</wp:posOffset>
+                </wp:positionH>
+                <wp:positionV relativeFrom="paragraph">
+                  <wp:posOffset>2468245</wp:posOffset>
+                </wp:positionV>
+                <wp:extent cx="2908300" cy="635"/>
+                <wp:effectExtent l="0" t="0" r="0" b="0"/>
+                <wp:wrapTopAndBottom/>
+                <wp:docPr id="85990881" name="Text Box 1"/>
+                <wp:cNvGraphicFramePr/>
+                <a:graphic xmlns:a="http://schemas.openxmlformats.org/drawingml/2006/main">
+                  <a:graphicData uri="http://schemas.microsoft.com/office/word/2010/wordprocessingShape">
+                    <wps:wsp>
+                      <wps:cNvSpPr txBox="1"/>
+                      <wps:spPr>
+                        <a:xfrm>
+                          <a:off x="0" y="0"/>
+                          <a:ext cx="2908300" cy="635"/>
+                        </a:xfrm>
+                        <a:prstGeom prst="rect">
+                          <a:avLst/>
+                        </a:prstGeom>
+                        <a:solidFill>
+                          <a:prstClr val="white"/>
+                        </a:solidFill>
+                        <a:ln>
+                          <a:noFill/>
+                        </a:ln>
+                      </wps:spPr>
+                      <wps:txbx>
+                        <w:txbxContent>
+                          <w:p>
+                            <w:pPr>
+                              <w:pStyle w:val="Caption"/>
+                            </w:pPr>
+                            <w:r>
+                              <w:t xml:space="preserve">Abbildung </w:t>
+                            </w:r>
+                            <w:r>
+                              <w:fldChar w:fldCharType="begin"/>
+                            </w:r>
+                            <w:r>
+                              <w:instrText xml:space="preserve"> SEQ Abbildung \* ARABIC </w:instrText>
+                            </w:r>
+                            <w:r>
+                              <w:fldChar w:fldCharType="separate"/>
+                            </w:r>
+                            <w:r>
+                              <w:rPr>
+                                <w:noProof/>
+                              </w:rPr>
+                              <w:t>5</w:t>
+                            </w:r>
+                            <w:r>
+                              <w:fldChar w:fldCharType="end"/>
+                            </w:r>
+                            <w:r>
+                              <w:t>: Triangle Wave</w:t>
+                            </w:r>
+                          </w:p>
+                        </w:txbxContent>
+                      </wps:txbx>
+                      <wps:bodyPr rot="0" spcFirstLastPara="0" vertOverflow="overflow" horzOverflow="overflow" vert="horz" wrap="square" lIns="0" tIns="0" rIns="0" bIns="0" numCol="1" spcCol="0" rtlCol="0" fromWordArt="0" anchor="t" anchorCtr="0" forceAA="0" compatLnSpc="1">
+                        <a:prstTxWarp prst="textNoShape">
+                          <a:avLst/>
+                        </a:prstTxWarp>
+                        <a:spAutoFit/>
+                      </wps:bodyPr>
+                    </wps:wsp>
+                  </a:graphicData>
+                </a:graphic>
+              </wp:anchor>
+            </w:drawing>
+          </mc:Choice>
+          <mc:Fallback>
+            <w:pict>
+              <v:shape w14:anchorId="250ECD14" id="_x0000_s1034" type="#_x0000_t202" style="position:absolute;left:0;text-align:left;margin-left:121pt;margin-top:194.35pt;width:229pt;height:.05pt;z-index:251714560;visibility:visible;mso-wrap-style:square;mso-wrap-distance-left:9pt;mso-wrap-distance-top:0;mso-wrap-distance-right:9pt;mso-wrap-distance-bottom:0;mso-position-horizontal:absolute;mso-position-horizontal-relative:text;mso-position-vertical:absolute;mso-position-vertical-relative:text;v-text-anchor:top" o:gfxdata="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" stroked="f">
+                <v:textbox style="mso-fit-shape-to-text:t" inset="0,0,0,0">
+                  <w:txbxContent>
+                    <w:p>
+                      <w:pPr>
+                        <w:pStyle w:val="Caption"/>
+                      </w:pPr>
+                      <w:r>
+                        <w:t xml:space="preserve">Abbildung </w:t>
+                      </w:r>
+                      <w:r>
+                        <w:fldChar w:fldCharType="begin"/>
+                      </w:r>
+                      <w:r>
+                        <w:instrText xml:space="preserve"> SEQ Abbildung \* ARABIC </w:instrText>
+                      </w:r>
+                      <w:r>
+                        <w:fldChar w:fldCharType="separate"/>
+                      </w:r>
+                      <w:r>
+                        <w:rPr>
+                          <w:noProof/>
+                        </w:rPr>
+                        <w:t>5</w:t>
+                      </w:r>
+                      <w:r>
+                        <w:fldChar w:fldCharType="end"/>
+                      </w:r>
+                      <w:r>
+                        <w:t>: Triangle Wave</w:t>
+                      </w:r>
+                    </w:p>
+                  </w:txbxContent>
+                </v:textbox>
+                <w10:wrap type="topAndBottom"/>
+              </v:shape>
+            </w:pict>
+          </mc:Fallback>
+        </mc:AlternateContent>
+      </w:r>
+    </w:p>
+    <w:p>
+      <w:r>
+        <w:rPr>
+          <w:noProof/>
+        </w:rPr>
+        <mc:AlternateContent>
+          <mc:Choice Requires="wps">
+            <w:drawing>
+              <wp:anchor distT="0" distB="0" distL="114300" distR="114300" simplePos="0" relativeHeight="251716608" behindDoc="0" locked="0" layoutInCell="1" allowOverlap="1" wp14:anchorId="4590F569" wp14:editId="1B10EAD6">
+                <wp:simplePos x="0" y="0"/>
+                <wp:positionH relativeFrom="column">
+                  <wp:posOffset>709930</wp:posOffset>
+                </wp:positionH>
+                <wp:positionV relativeFrom="paragraph">
+                  <wp:posOffset>3372485</wp:posOffset>
+                </wp:positionV>
+                <wp:extent cx="3762375" cy="635"/>
+                <wp:effectExtent l="0" t="0" r="0" b="0"/>
+                <wp:wrapTopAndBottom/>
+                <wp:docPr id="71897527" name="Text Box 1"/>
+                <wp:cNvGraphicFramePr/>
+                <a:graphic xmlns:a="http://schemas.openxmlformats.org/drawingml/2006/main">
+                  <a:graphicData uri="http://schemas.microsoft.com/office/word/2010/wordprocessingShape">
+                    <wps:wsp>
+                      <wps:cNvSpPr txBox="1"/>
+                      <wps:spPr>
+                        <a:xfrm>
+                          <a:off x="0" y="0"/>
+                          <a:ext cx="3762375" cy="635"/>
+                        </a:xfrm>
+                        <a:prstGeom prst="rect">
+                          <a:avLst/>
+                        </a:prstGeom>
+                        <a:solidFill>
+                          <a:prstClr val="white"/>
+                        </a:solidFill>
+                        <a:ln>
+                          <a:noFill/>
+                        </a:ln>
+                      </wps:spPr>
+                      <wps:txbx>
+                        <w:txbxContent>
+                          <w:p>
+                            <w:pPr>
+                              <w:pStyle w:val="Caption"/>
+                            </w:pPr>
+                            <w:r>
+                              <w:t xml:space="preserve">Abbildung </w:t>
+                            </w:r>
+                            <w:r>
+                              <w:fldChar w:fldCharType="begin"/>
+                            </w:r>
+                            <w:r>
+                              <w:instrText xml:space="preserve"> SEQ Abbildung \* ARABIC </w:instrText>
+                            </w:r>
+                            <w:r>
+                              <w:fldChar w:fldCharType="separate"/>
+                            </w:r>
+                            <w:r>
+                              <w:rPr>
+                                <w:noProof/>
+                              </w:rPr>
+                              <w:t>6</w:t>
+                            </w:r>
+                            <w:r>
+                              <w:fldChar w:fldCharType="end"/>
+                            </w:r>
+                            <w:r>
+                              <w:t>: Saw Wave</w:t>
+                            </w:r>
+                          </w:p>
+                        </w:txbxContent>
+                      </wps:txbx>
+                      <wps:bodyPr rot="0" spcFirstLastPara="0" vertOverflow="overflow" horzOverflow="overflow" vert="horz" wrap="square" lIns="0" tIns="0" rIns="0" bIns="0" numCol="1" spcCol="0" rtlCol="0" fromWordArt="0" anchor="t" anchorCtr="0" forceAA="0" compatLnSpc="1">
+                        <a:prstTxWarp prst="textNoShape">
+                          <a:avLst/>
+                        </a:prstTxWarp>
+                        <a:spAutoFit/>
+                      </wps:bodyPr>
+                    </wps:wsp>
+                  </a:graphicData>
+                </a:graphic>
+              </wp:anchor>
+            </w:drawing>
+          </mc:Choice>
+          <mc:Fallback>
+            <w:pict>
+              <v:shape w14:anchorId="4590F569" id="_x0000_s1035" type="#_x0000_t202" style="position:absolute;left:0;text-align:left;margin-left:55.9pt;margin-top:265.55pt;width:296.25pt;height:.05pt;z-index:251716608;visibility:visible;mso-wrap-style:square;mso-wrap-distance-left:9pt;mso-wrap-distance-top:0;mso-wrap-distance-right:9pt;mso-wrap-distance-bottom:0;mso-position-horizontal:absolute;mso-position-horizontal-relative:text;mso-position-vertical:absolute;mso-position-vertical-relative:text;v-text-anchor:top" o:gfxdata="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" stroked="f">
+                <v:textbox style="mso-fit-shape-to-text:t" inset="0,0,0,0">
+                  <w:txbxContent>
+                    <w:p>
+                      <w:pPr>
+                        <w:pStyle w:val="Caption"/>
+                      </w:pPr>
+                      <w:r>
+                        <w:t xml:space="preserve">Abbildung </w:t>
+                      </w:r>
+                      <w:r>
+                        <w:fldChar w:fldCharType="begin"/>
+                      </w:r>
+                      <w:r>
+                        <w:instrText xml:space="preserve"> SEQ Abbildung \* ARABIC </w:instrText>
+                      </w:r>
+                      <w:r>
+                        <w:fldChar w:fldCharType="separate"/>
+                      </w:r>
+                      <w:r>
+                        <w:rPr>
+                          <w:noProof/>
+                        </w:rPr>
+                        <w:t>6</w:t>
+                      </w:r>
+                      <w:r>
+                        <w:fldChar w:fldCharType="end"/>
+                      </w:r>
+                      <w:r>
+                        <w:t>: Saw Wave</w:t>
+                      </w:r>
+                    </w:p>
+                  </w:txbxContent>
+                </v:textbox>
+                <w10:wrap type="topAndBottom"/>
+              </v:shape>
+            </w:pict>
+          </mc:Fallback>
+        </mc:AlternateContent>
+      </w:r>
+      <w:r>
+        <w:drawing>
+          <wp:anchor distT="0" distB="0" distL="114300" distR="114300" simplePos="0" relativeHeight="251712512" behindDoc="0" locked="0" layoutInCell="1" allowOverlap="1" wp14:anchorId="2315AF91" wp14:editId="029FD436">
+            <wp:simplePos x="0" y="0"/>
+            <wp:positionH relativeFrom="margin">
+              <wp:align>center</wp:align>
+            </wp:positionH>
+            <wp:positionV relativeFrom="paragraph">
+              <wp:posOffset>289279</wp:posOffset>
+            </wp:positionV>
+            <wp:extent cx="3762797" cy="3027019"/>
+            <wp:effectExtent l="0" t="0" r="0" b="2540"/>
+            <wp:wrapTopAndBottom/>
+            <wp:docPr id="2043713764" name="Picture 1" descr="A screenshot of a computer&#10;&#10;AI-generated content may be incorrect."/>
+            <wp:cNvGraphicFramePr>
+              <a:graphicFrameLocks xmlns:a="http://schemas.openxmlformats.org/drawingml/2006/main" noChangeAspect="1"/>
+            </wp:cNvGraphicFramePr>
+            <a:graphic xmlns:a="http://schemas.openxmlformats.org/drawingml/2006/main">
+              <a:graphicData uri="http://schemas.openxmlformats.org/drawingml/2006/picture">
+                <pic:pic xmlns:pic="http://schemas.openxmlformats.org/drawingml/2006/picture">
+                  <pic:nvPicPr>
+                    <pic:cNvPr id="2043713764" name="Picture 1" descr="A screenshot of a computer&#10;&#10;AI-generated content may be incorrect."/>
+                    <pic:cNvPicPr/>
+                  </pic:nvPicPr>
+                  <pic:blipFill>
+                    <a:blip r:embed="rId13" cstate="print">
+                      <a:extLst>
+                        <a:ext uri="{28A0092B-C50C-407E-A947-70E740481C1C}">
+                          <a14:useLocalDpi xmlns:a14="http://schemas.microsoft.com/office/drawing/2010/main" val="0"/>
+                        </a:ext>
+                      </a:extLst>
+                    </a:blip>
+                    <a:stretch>
+                      <a:fillRect/>
+                    </a:stretch>
+                  </pic:blipFill>
+                  <pic:spPr>
+                    <a:xfrm>
+                      <a:off x="0" y="0"/>
+                      <a:ext cx="3762797" cy="3027019"/>
+                    </a:xfrm>
+                    <a:prstGeom prst="rect">
+                      <a:avLst/>
+                    </a:prstGeom>
+                  </pic:spPr>
+                </pic:pic>
+              </a:graphicData>
+            </a:graphic>
+          </wp:anchor>
+        </w:drawing>
+      </w:r>
+    </w:p>
+    <w:p/>
+    <w:p>
+      <w:r>
+        <w:t xml:space="preserve">Im Triangle Modus, sah man Dreiecke im </w:t>
+      </w:r>
+      <w:r>
+        <w:t>Oszilloskop</w:t>
+      </w:r>
+      <w:r>
+        <w:t xml:space="preserve">. Im Saw Modus, sah man Sägezähne. </w:t>
+      </w:r>
+      <w:r>
+        <w:t>Die Triangle</w:t>
+      </w:r>
+      <w:r>
+        <w:t xml:space="preserve">-Welle mit einer Base Frequency von 100 Hz, besteht aus den Frequenzen 100 Hz, 200 Hz, 400 Hz, usw. Jeder Schritt ist eine Verdoppelung. </w:t>
+      </w:r>
+      <w:r>
+        <w:t xml:space="preserve">Bei Saw </w:t>
+      </w:r>
+      <w:r>
+        <w:t xml:space="preserve">sind die einzelnen Frequenzen in 100 Hz Schritte definiert. </w:t>
+      </w:r>
+      <w:r>
+        <w:t xml:space="preserve">Saw hat mehr Obertöne als Triangle. </w:t>
+      </w:r>
+    </w:p>
+    <w:p>
+      <w:pPr>
+        <w:pStyle w:val="Heading2"/>
+      </w:pPr>
+      <w:r>
+        <w:lastRenderedPageBreak/>
+        <w:t>1.4</w:t>
+      </w:r>
+    </w:p>
+    <w:p>
+      <w:pPr>
+        <w:pStyle w:val="Quote"/>
+      </w:pPr>
+      <w:r>
+        <w:t>Schicken Sie beide Rauschen (white noise und pink noise) in den Analyzer. Was ist der Unterschied zwischen pink und white noise?</w:t>
+      </w:r>
+    </w:p>
+    <w:p>
+      <w:r>
+        <w:rPr>
+          <w:noProof/>
+        </w:rPr>
+        <mc:AlternateContent>
+          <mc:Choice Requires="wps">
+            <w:drawing>
+              <wp:anchor distT="0" distB="0" distL="114300" distR="114300" simplePos="0" relativeHeight="251719680" behindDoc="0" locked="0" layoutInCell="1" allowOverlap="1" wp14:anchorId="6D28B899" wp14:editId="026AD174">
+                <wp:simplePos x="0" y="0"/>
+                <wp:positionH relativeFrom="column">
+                  <wp:posOffset>475615</wp:posOffset>
+                </wp:positionH>
+                <wp:positionV relativeFrom="paragraph">
+                  <wp:posOffset>4326255</wp:posOffset>
+                </wp:positionV>
+                <wp:extent cx="4231640" cy="635"/>
+                <wp:effectExtent l="0" t="0" r="0" b="0"/>
+                <wp:wrapTopAndBottom/>
+                <wp:docPr id="1388113096" name="Text Box 1"/>
+                <wp:cNvGraphicFramePr/>
+                <a:graphic xmlns:a="http://schemas.openxmlformats.org/drawingml/2006/main">
+                  <a:graphicData uri="http://schemas.microsoft.com/office/word/2010/wordprocessingShape">
+                    <wps:wsp>
+                      <wps:cNvSpPr txBox="1"/>
+                      <wps:spPr>
+                        <a:xfrm>
+                          <a:off x="0" y="0"/>
+                          <a:ext cx="4231640" cy="635"/>
+                        </a:xfrm>
+                        <a:prstGeom prst="rect">
+                          <a:avLst/>
+                        </a:prstGeom>
+                        <a:solidFill>
+                          <a:prstClr val="white"/>
+                        </a:solidFill>
+                        <a:ln>
+                          <a:noFill/>
+                        </a:ln>
+                      </wps:spPr>
+                      <wps:txbx>
+                        <w:txbxContent>
+                          <w:p>
+                            <w:pPr>
+                              <w:pStyle w:val="Caption"/>
+                            </w:pPr>
+                            <w:r>
+                              <w:t xml:space="preserve">Abbildung </w:t>
+                            </w:r>
+                            <w:r>
+                              <w:fldChar w:fldCharType="begin"/>
+                            </w:r>
+                            <w:r>
+                              <w:instrText xml:space="preserve"> SEQ Abbildung \* ARABIC </w:instrText>
+                            </w:r>
+                            <w:r>
+                              <w:fldChar w:fldCharType="separate"/>
+                            </w:r>
+                            <w:r>
+                              <w:rPr>
+                                <w:noProof/>
+                              </w:rPr>
+                              <w:t>7</w:t>
+                            </w:r>
+                            <w:r>
+                              <w:fldChar w:fldCharType="end"/>
+                            </w:r>
+                            <w:r>
+                              <w:t>: White Noise</w:t>
+                            </w:r>
+                          </w:p>
+                        </w:txbxContent>
+                      </wps:txbx>
+                      <wps:bodyPr rot="0" spcFirstLastPara="0" vertOverflow="overflow" horzOverflow="overflow" vert="horz" wrap="square" lIns="0" tIns="0" rIns="0" bIns="0" numCol="1" spcCol="0" rtlCol="0" fromWordArt="0" anchor="t" anchorCtr="0" forceAA="0" compatLnSpc="1">
+                        <a:prstTxWarp prst="textNoShape">
+                          <a:avLst/>
+                        </a:prstTxWarp>
+                        <a:spAutoFit/>
+                      </wps:bodyPr>
+                    </wps:wsp>
+                  </a:graphicData>
+                </a:graphic>
+              </wp:anchor>
+            </w:drawing>
+          </mc:Choice>
+          <mc:Fallback>
+            <w:pict>
+              <v:shape w14:anchorId="6D28B899" id="_x0000_s1036" type="#_x0000_t202" style="position:absolute;left:0;text-align:left;margin-left:37.45pt;margin-top:340.65pt;width:333.2pt;height:.05pt;z-index:251719680;visibility:visible;mso-wrap-style:square;mso-wrap-distance-left:9pt;mso-wrap-distance-top:0;mso-wrap-distance-right:9pt;mso-wrap-distance-bottom:0;mso-position-horizontal:absolute;mso-position-horizontal-relative:text;mso-position-vertical:absolute;mso-position-vertical-relative:text;v-text-anchor:top" o:gfxdata="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" stroked="f">
+                <v:textbox style="mso-fit-shape-to-text:t" inset="0,0,0,0">
+                  <w:txbxContent>
+                    <w:p>
+                      <w:pPr>
+                        <w:pStyle w:val="Caption"/>
+                      </w:pPr>
+                      <w:r>
+                        <w:t xml:space="preserve">Abbildung </w:t>
+                      </w:r>
+                      <w:r>
+                        <w:fldChar w:fldCharType="begin"/>
+                      </w:r>
+                      <w:r>
+                        <w:instrText xml:space="preserve"> SEQ Abbildung \* ARABIC </w:instrText>
+                      </w:r>
+                      <w:r>
+                        <w:fldChar w:fldCharType="separate"/>
+                      </w:r>
+                      <w:r>
+                        <w:rPr>
+                          <w:noProof/>
+                        </w:rPr>
+                        <w:t>7</w:t>
+                      </w:r>
+                      <w:r>
+                        <w:fldChar w:fldCharType="end"/>
+                      </w:r>
+                      <w:r>
+                        <w:t>: White Noise</w:t>
+                      </w:r>
+                    </w:p>
+                  </w:txbxContent>
+                </v:textbox>
+                <w10:wrap type="topAndBottom"/>
+              </v:shape>
+            </w:pict>
+          </mc:Fallback>
+        </mc:AlternateContent>
+      </w:r>
+      <w:r>
+        <w:drawing>
+          <wp:anchor distT="0" distB="0" distL="114300" distR="114300" simplePos="0" relativeHeight="251717632" behindDoc="0" locked="0" layoutInCell="1" allowOverlap="1" wp14:anchorId="280B6F2C" wp14:editId="12F9F6C2">
+            <wp:simplePos x="0" y="0"/>
+            <wp:positionH relativeFrom="margin">
+              <wp:align>center</wp:align>
+            </wp:positionH>
+            <wp:positionV relativeFrom="paragraph">
+              <wp:posOffset>332409</wp:posOffset>
+            </wp:positionV>
+            <wp:extent cx="4231640" cy="3937000"/>
+            <wp:effectExtent l="0" t="0" r="0" b="6350"/>
+            <wp:wrapTopAndBottom/>
+            <wp:docPr id="1845127714" name="Picture 1" descr="A screenshot of a computer&#10;&#10;AI-generated content may be incorrect."/>
+            <wp:cNvGraphicFramePr>
+              <a:graphicFrameLocks xmlns:a="http://schemas.openxmlformats.org/drawingml/2006/main" noChangeAspect="1"/>
+            </wp:cNvGraphicFramePr>
+            <a:graphic xmlns:a="http://schemas.openxmlformats.org/drawingml/2006/main">
+              <a:graphicData uri="http://schemas.openxmlformats.org/drawingml/2006/picture">
+                <pic:pic xmlns:pic="http://schemas.openxmlformats.org/drawingml/2006/picture">
+                  <pic:nvPicPr>
+                    <pic:cNvPr id="1845127714" name="Picture 1" descr="A screenshot of a computer&#10;&#10;AI-generated content may be incorrect."/>
+                    <pic:cNvPicPr/>
+                  </pic:nvPicPr>
+                  <pic:blipFill>
+                    <a:blip r:embed="rId14" cstate="print">
+                      <a:extLst>
+                        <a:ext uri="{28A0092B-C50C-407E-A947-70E740481C1C}">
+                          <a14:useLocalDpi xmlns:a14="http://schemas.microsoft.com/office/drawing/2010/main" val="0"/>
+                        </a:ext>
+                      </a:extLst>
+                    </a:blip>
+                    <a:stretch>
+                      <a:fillRect/>
+                    </a:stretch>
+                  </pic:blipFill>
+                  <pic:spPr>
+                    <a:xfrm>
+                      <a:off x="0" y="0"/>
+                      <a:ext cx="4231640" cy="3937000"/>
+                    </a:xfrm>
+                    <a:prstGeom prst="rect">
+                      <a:avLst/>
+                    </a:prstGeom>
+                  </pic:spPr>
+                </pic:pic>
+              </a:graphicData>
+            </a:graphic>
+            <wp14:sizeRelH relativeFrom="margin">
+              <wp14:pctWidth>0</wp14:pctWidth>
+            </wp14:sizeRelH>
+            <wp14:sizeRelV relativeFrom="margin">
+              <wp14:pctHeight>0</wp14:pctHeight>
+            </wp14:sizeRelV>
+          </wp:anchor>
+        </w:drawing>
+      </w:r>
+    </w:p>
+    <w:p/>
+    <w:p>
+      <w:r>
+        <w:rPr>
+          <w:noProof/>
+        </w:rPr>
+        <w:lastRenderedPageBreak/>
+        <mc:AlternateContent>
+          <mc:Choice Requires="wps">
+            <w:drawing>
+              <wp:anchor distT="0" distB="0" distL="114300" distR="114300" simplePos="0" relativeHeight="251722752" behindDoc="0" locked="0" layoutInCell="1" allowOverlap="1" wp14:anchorId="145CA753" wp14:editId="55850E67">
+                <wp:simplePos x="0" y="0"/>
+                <wp:positionH relativeFrom="column">
+                  <wp:posOffset>0</wp:posOffset>
+                </wp:positionH>
+                <wp:positionV relativeFrom="paragraph">
+                  <wp:posOffset>5030470</wp:posOffset>
+                </wp:positionV>
+                <wp:extent cx="5182870" cy="635"/>
+                <wp:effectExtent l="0" t="0" r="0" b="0"/>
+                <wp:wrapTopAndBottom/>
+                <wp:docPr id="270293803" name="Text Box 1"/>
+                <wp:cNvGraphicFramePr/>
+                <a:graphic xmlns:a="http://schemas.openxmlformats.org/drawingml/2006/main">
+                  <a:graphicData uri="http://schemas.microsoft.com/office/word/2010/wordprocessingShape">
+                    <wps:wsp>
+                      <wps:cNvSpPr txBox="1"/>
+                      <wps:spPr>
+                        <a:xfrm>
+                          <a:off x="0" y="0"/>
+                          <a:ext cx="5182870" cy="635"/>
+                        </a:xfrm>
+                        <a:prstGeom prst="rect">
+                          <a:avLst/>
+                        </a:prstGeom>
+                        <a:solidFill>
+                          <a:prstClr val="white"/>
+                        </a:solidFill>
+                        <a:ln>
+                          <a:noFill/>
+                        </a:ln>
+                      </wps:spPr>
+                      <wps:txbx>
+                        <w:txbxContent>
+                          <w:p>
+                            <w:pPr>
+                              <w:pStyle w:val="Caption"/>
+                            </w:pPr>
+                            <w:r>
+                              <w:t xml:space="preserve">Abbildung </w:t>
+                            </w:r>
+                            <w:r>
+                              <w:fldChar w:fldCharType="begin"/>
+                            </w:r>
+                            <w:r>
+                              <w:instrText xml:space="preserve"> SEQ Abbildung \* ARABIC </w:instrText>
+                            </w:r>
+                            <w:r>
+                              <w:fldChar w:fldCharType="separate"/>
+                            </w:r>
+                            <w:r>
+                              <w:rPr>
+                                <w:noProof/>
+                              </w:rPr>
+                              <w:t>8</w:t>
+                            </w:r>
+                            <w:r>
+                              <w:fldChar w:fldCharType="end"/>
+                            </w:r>
+                            <w:r>
+                              <w:t>: Pink Noise</w:t>
+                            </w:r>
+                          </w:p>
+                        </w:txbxContent>
+                      </wps:txbx>
+                      <wps:bodyPr rot="0" spcFirstLastPara="0" vertOverflow="overflow" horzOverflow="overflow" vert="horz" wrap="square" lIns="0" tIns="0" rIns="0" bIns="0" numCol="1" spcCol="0" rtlCol="0" fromWordArt="0" anchor="t" anchorCtr="0" forceAA="0" compatLnSpc="1">
+                        <a:prstTxWarp prst="textNoShape">
+                          <a:avLst/>
+                        </a:prstTxWarp>
+                        <a:spAutoFit/>
+                      </wps:bodyPr>
+                    </wps:wsp>
+                  </a:graphicData>
+                </a:graphic>
+              </wp:anchor>
+            </w:drawing>
+          </mc:Choice>
+          <mc:Fallback>
+            <w:pict>
+              <v:shape w14:anchorId="145CA753" id="_x0000_s1037" type="#_x0000_t202" style="position:absolute;left:0;text-align:left;margin-left:0;margin-top:396.1pt;width:408.1pt;height:.05pt;z-index:251722752;visibility:visible;mso-wrap-style:square;mso-wrap-distance-left:9pt;mso-wrap-distance-top:0;mso-wrap-distance-right:9pt;mso-wrap-distance-bottom:0;mso-position-horizontal:absolute;mso-position-horizontal-relative:text;mso-position-vertical:absolute;mso-position-vertical-relative:text;v-text-anchor:top" o:gfxdata="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" stroked="f">
+                <v:textbox style="mso-fit-shape-to-text:t" inset="0,0,0,0">
+                  <w:txbxContent>
+                    <w:p>
+                      <w:pPr>
+                        <w:pStyle w:val="Caption"/>
+                      </w:pPr>
+                      <w:r>
+                        <w:t xml:space="preserve">Abbildung </w:t>
+                      </w:r>
+                      <w:r>
+                        <w:fldChar w:fldCharType="begin"/>
+                      </w:r>
+                      <w:r>
+                        <w:instrText xml:space="preserve"> SEQ Abbildung \* ARABIC </w:instrText>
+                      </w:r>
+                      <w:r>
+                        <w:fldChar w:fldCharType="separate"/>
+                      </w:r>
+                      <w:r>
+                        <w:rPr>
+                          <w:noProof/>
+                        </w:rPr>
+                        <w:t>8</w:t>
+                      </w:r>
+                      <w:r>
+                        <w:fldChar w:fldCharType="end"/>
+                      </w:r>
+                      <w:r>
+                        <w:t>: Pink Noise</w:t>
+                      </w:r>
+                    </w:p>
+                  </w:txbxContent>
+                </v:textbox>
+                <w10:wrap type="topAndBottom"/>
+              </v:shape>
+            </w:pict>
+          </mc:Fallback>
+        </mc:AlternateContent>
+      </w:r>
+      <w:r>
+        <w:drawing>
+          <wp:anchor distT="0" distB="0" distL="114300" distR="114300" simplePos="0" relativeHeight="251720704" behindDoc="0" locked="0" layoutInCell="1" allowOverlap="1" wp14:anchorId="346F83C9" wp14:editId="08819735">
+            <wp:simplePos x="0" y="0"/>
+            <wp:positionH relativeFrom="margin">
+              <wp:align>right</wp:align>
+            </wp:positionH>
+            <wp:positionV relativeFrom="paragraph">
+              <wp:posOffset>163</wp:posOffset>
+            </wp:positionV>
+            <wp:extent cx="5182870" cy="4973320"/>
+            <wp:effectExtent l="0" t="0" r="0" b="0"/>
+            <wp:wrapTopAndBottom/>
+            <wp:docPr id="1121064656" name="Picture 1" descr="A screenshot of a computer&#10;&#10;AI-generated content may be incorrect."/>
+            <wp:cNvGraphicFramePr>
+              <a:graphicFrameLocks xmlns:a="http://schemas.openxmlformats.org/drawingml/2006/main" noChangeAspect="1"/>
+            </wp:cNvGraphicFramePr>
+            <a:graphic xmlns:a="http://schemas.openxmlformats.org/drawingml/2006/main">
+              <a:graphicData uri="http://schemas.openxmlformats.org/drawingml/2006/picture">
+                <pic:pic xmlns:pic="http://schemas.openxmlformats.org/drawingml/2006/picture">
+                  <pic:nvPicPr>
+                    <pic:cNvPr id="1121064656" name="Picture 1" descr="A screenshot of a computer&#10;&#10;AI-generated content may be incorrect."/>
+                    <pic:cNvPicPr/>
+                  </pic:nvPicPr>
+                  <pic:blipFill>
+                    <a:blip r:embed="rId15">
+                      <a:extLst>
+                        <a:ext uri="{28A0092B-C50C-407E-A947-70E740481C1C}">
+                          <a14:useLocalDpi xmlns:a14="http://schemas.microsoft.com/office/drawing/2010/main" val="0"/>
+                        </a:ext>
+                      </a:extLst>
+                    </a:blip>
+                    <a:stretch>
+                      <a:fillRect/>
+                    </a:stretch>
+                  </pic:blipFill>
+                  <pic:spPr>
+                    <a:xfrm>
+                      <a:off x="0" y="0"/>
+                      <a:ext cx="5182870" cy="4973320"/>
+                    </a:xfrm>
+                    <a:prstGeom prst="rect">
+                      <a:avLst/>
+                    </a:prstGeom>
+                  </pic:spPr>
+                </pic:pic>
+              </a:graphicData>
+            </a:graphic>
+          </wp:anchor>
+        </w:drawing>
+      </w:r>
+      <w:r>
+        <w:t>Der Unterschied zwischen Pink und White Noise ist, dass die höheren Frequenzen bei Pink Noise leiser sind als die niedrigeren, wobei bei White Noise alle Frequenzen gleichmäßig laut sind.</w:t>
+      </w:r>
+    </w:p>
+    <w:p/>
+    <w:p>
+      <w:pPr>
+        <w:jc w:val="left"/>
         <w:rPr>
           <w:rFonts w:eastAsiaTheme="majorEastAsia" w:cstheme="majorBidi"/>
-          <w:color w:val="501549" w:themeColor="accent5" w:themeShade="80"/>
-          <w:sz w:val="32"/>
-          <w:szCs w:val="32"/>
+          <w:b/>
+          <w:color w:val="4D0264"/>
+          <w:sz w:val="40"/>
+          <w:szCs w:val="40"/>
+          <w:lang w:val="en-US"/>
         </w:rPr>
       </w:pPr>
       <w:r>
+        <w:rPr>
+          <w:lang w:val="en-US"/>
+        </w:rPr>
         <w:br w:type="page"/>
+      </w:r>
+    </w:p>
+    <w:p>
+      <w:pPr>
+        <w:pStyle w:val="Heading1"/>
+        <w:rPr>
+          <w:lang w:val="en-US"/>
+        </w:rPr>
+      </w:pPr>
+      <w:r>
+        <w:rPr>
+          <w:lang w:val="en-US"/>
+        </w:rPr>
+        <w:lastRenderedPageBreak/>
+        <w:t>Samplerate / Aliasing</w:t>
+      </w:r>
+    </w:p>
+    <w:p>
+      <w:pPr>
+        <w:pStyle w:val="Heading2"/>
+      </w:pPr>
+      <w:r>
+        <w:t>2.1</w:t>
+      </w:r>
+    </w:p>
+    <w:p>
+      <w:pPr>
+        <w:pStyle w:val="Quote"/>
+        <w:rPr>
+          <w:rStyle w:val="SubtleEmphasis"/>
+          <w:lang w:val="en-US"/>
+        </w:rPr>
+      </w:pPr>
+      <w:r>
+        <w:rPr>
+          <w:rStyle w:val="SubtleEmphasis"/>
+        </w:rPr>
+        <w:t xml:space="preserve">Samplerate des Audiotreibers auf 44.1kHz stellen. Track 8 (sine 30kHz) einschalten und am frequency analyzer ablesen. </w:t>
+      </w:r>
+      <w:r>
+        <w:rPr>
+          <w:rStyle w:val="SubtleEmphasis"/>
+          <w:lang w:val="en-US"/>
+        </w:rPr>
+        <w:t>Warum stimmen die Werte nicht überein?</w:t>
+      </w:r>
+    </w:p>
+    <w:p>
+      <w:pPr>
+        <w:rPr>
+          <w:lang w:val="en-US"/>
+        </w:rPr>
+      </w:pPr>
+      <w:r>
+        <w:rPr>
+          <w:noProof/>
+        </w:rPr>
+        <mc:AlternateContent>
+          <mc:Choice Requires="wps">
+            <w:drawing>
+              <wp:anchor distT="0" distB="0" distL="114300" distR="114300" simplePos="0" relativeHeight="251725824" behindDoc="0" locked="0" layoutInCell="1" allowOverlap="1" wp14:anchorId="4AF3770D" wp14:editId="4B93E0E5">
+                <wp:simplePos x="0" y="0"/>
+                <wp:positionH relativeFrom="column">
+                  <wp:posOffset>572135</wp:posOffset>
+                </wp:positionH>
+                <wp:positionV relativeFrom="paragraph">
+                  <wp:posOffset>3277235</wp:posOffset>
+                </wp:positionV>
+                <wp:extent cx="4030980" cy="635"/>
+                <wp:effectExtent l="0" t="0" r="0" b="0"/>
+                <wp:wrapTopAndBottom/>
+                <wp:docPr id="14249879" name="Text Box 1"/>
+                <wp:cNvGraphicFramePr/>
+                <a:graphic xmlns:a="http://schemas.openxmlformats.org/drawingml/2006/main">
+                  <a:graphicData uri="http://schemas.microsoft.com/office/word/2010/wordprocessingShape">
+                    <wps:wsp>
+                      <wps:cNvSpPr txBox="1"/>
+                      <wps:spPr>
+                        <a:xfrm>
+                          <a:off x="0" y="0"/>
+                          <a:ext cx="4030980" cy="635"/>
+                        </a:xfrm>
+                        <a:prstGeom prst="rect">
+                          <a:avLst/>
+                        </a:prstGeom>
+                        <a:solidFill>
+                          <a:prstClr val="white"/>
+                        </a:solidFill>
+                        <a:ln>
+                          <a:noFill/>
+                        </a:ln>
+                      </wps:spPr>
+                      <wps:txbx>
+                        <w:txbxContent>
+                          <w:p>
+                            <w:pPr>
+                              <w:pStyle w:val="Caption"/>
+                              <w:rPr>
+                                <w:lang w:val="en-US"/>
+                              </w:rPr>
+                            </w:pPr>
+                            <w:r>
+                              <w:t xml:space="preserve">Abbildung </w:t>
+                            </w:r>
+                            <w:r>
+                              <w:fldChar w:fldCharType="begin"/>
+                            </w:r>
+                            <w:r>
+                              <w:instrText xml:space="preserve"> SEQ Abbildung \* ARABIC </w:instrText>
+                            </w:r>
+                            <w:r>
+                              <w:fldChar w:fldCharType="separate"/>
+                            </w:r>
+                            <w:r>
+                              <w:rPr>
+                                <w:noProof/>
+                              </w:rPr>
+                              <w:t>9</w:t>
+                            </w:r>
+                            <w:r>
+                              <w:fldChar w:fldCharType="end"/>
+                            </w:r>
+                            <w:r>
+                              <w:t>: 30 kHz @ 44.1 kHz Samplerate</w:t>
+                            </w:r>
+                          </w:p>
+                        </w:txbxContent>
+                      </wps:txbx>
+                      <wps:bodyPr rot="0" spcFirstLastPara="0" vertOverflow="overflow" horzOverflow="overflow" vert="horz" wrap="square" lIns="0" tIns="0" rIns="0" bIns="0" numCol="1" spcCol="0" rtlCol="0" fromWordArt="0" anchor="t" anchorCtr="0" forceAA="0" compatLnSpc="1">
+                        <a:prstTxWarp prst="textNoShape">
+                          <a:avLst/>
+                        </a:prstTxWarp>
+                        <a:spAutoFit/>
+                      </wps:bodyPr>
+                    </wps:wsp>
+                  </a:graphicData>
+                </a:graphic>
+              </wp:anchor>
+            </w:drawing>
+          </mc:Choice>
+          <mc:Fallback>
+            <w:pict>
+              <v:shape w14:anchorId="4AF3770D" id="_x0000_s1038" type="#_x0000_t202" style="position:absolute;left:0;text-align:left;margin-left:45.05pt;margin-top:258.05pt;width:317.4pt;height:.05pt;z-index:251725824;visibility:visible;mso-wrap-style:square;mso-wrap-distance-left:9pt;mso-wrap-distance-top:0;mso-wrap-distance-right:9pt;mso-wrap-distance-bottom:0;mso-position-horizontal:absolute;mso-position-horizontal-relative:text;mso-position-vertical:absolute;mso-position-vertical-relative:text;v-text-anchor:top" o:gfxdata="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" stroked="f">
+                <v:textbox style="mso-fit-shape-to-text:t" inset="0,0,0,0">
+                  <w:txbxContent>
+                    <w:p>
+                      <w:pPr>
+                        <w:pStyle w:val="Caption"/>
+                        <w:rPr>
+                          <w:lang w:val="en-US"/>
+                        </w:rPr>
+                      </w:pPr>
+                      <w:r>
+                        <w:t xml:space="preserve">Abbildung </w:t>
+                      </w:r>
+                      <w:r>
+                        <w:fldChar w:fldCharType="begin"/>
+                      </w:r>
+                      <w:r>
+                        <w:instrText xml:space="preserve"> SEQ Abbildung \* ARABIC </w:instrText>
+                      </w:r>
+                      <w:r>
+                        <w:fldChar w:fldCharType="separate"/>
+                      </w:r>
+                      <w:r>
+                        <w:rPr>
+                          <w:noProof/>
+                        </w:rPr>
+                        <w:t>9</w:t>
+                      </w:r>
+                      <w:r>
+                        <w:fldChar w:fldCharType="end"/>
+                      </w:r>
+                      <w:r>
+                        <w:t>: 30 kHz @ 44.1 kHz Samplerate</w:t>
+                      </w:r>
+                    </w:p>
+                  </w:txbxContent>
+                </v:textbox>
+                <w10:wrap type="topAndBottom"/>
+              </v:shape>
+            </w:pict>
+          </mc:Fallback>
+        </mc:AlternateContent>
+      </w:r>
+      <w:r>
+        <w:rPr>
+          <w:lang w:val="en-US"/>
+        </w:rPr>
+        <w:drawing>
+          <wp:anchor distT="0" distB="0" distL="114300" distR="114300" simplePos="0" relativeHeight="251723776" behindDoc="0" locked="0" layoutInCell="1" allowOverlap="1" wp14:anchorId="1AA5B905" wp14:editId="044B8DE6">
+            <wp:simplePos x="0" y="0"/>
+            <wp:positionH relativeFrom="margin">
+              <wp:align>center</wp:align>
+            </wp:positionH>
+            <wp:positionV relativeFrom="paragraph">
+              <wp:posOffset>258945</wp:posOffset>
+            </wp:positionV>
+            <wp:extent cx="4030980" cy="2961640"/>
+            <wp:effectExtent l="0" t="0" r="7620" b="0"/>
+            <wp:wrapTopAndBottom/>
+            <wp:docPr id="1251932399" name="Picture 1" descr="A screenshot of a computer&#10;&#10;AI-generated content may be incorrect."/>
+            <wp:cNvGraphicFramePr>
+              <a:graphicFrameLocks xmlns:a="http://schemas.openxmlformats.org/drawingml/2006/main" noChangeAspect="1"/>
+            </wp:cNvGraphicFramePr>
+            <a:graphic xmlns:a="http://schemas.openxmlformats.org/drawingml/2006/main">
+              <a:graphicData uri="http://schemas.openxmlformats.org/drawingml/2006/picture">
+                <pic:pic xmlns:pic="http://schemas.openxmlformats.org/drawingml/2006/picture">
+                  <pic:nvPicPr>
+                    <pic:cNvPr id="1251932399" name="Picture 1" descr="A screenshot of a computer&#10;&#10;AI-generated content may be incorrect."/>
+                    <pic:cNvPicPr/>
+                  </pic:nvPicPr>
+                  <pic:blipFill>
+                    <a:blip r:embed="rId16" cstate="print">
+                      <a:extLst>
+                        <a:ext uri="{28A0092B-C50C-407E-A947-70E740481C1C}">
+                          <a14:useLocalDpi xmlns:a14="http://schemas.microsoft.com/office/drawing/2010/main" val="0"/>
+                        </a:ext>
+                      </a:extLst>
+                    </a:blip>
+                    <a:stretch>
+                      <a:fillRect/>
+                    </a:stretch>
+                  </pic:blipFill>
+                  <pic:spPr>
+                    <a:xfrm>
+                      <a:off x="0" y="0"/>
+                      <a:ext cx="4030980" cy="2961640"/>
+                    </a:xfrm>
+                    <a:prstGeom prst="rect">
+                      <a:avLst/>
+                    </a:prstGeom>
+                  </pic:spPr>
+                </pic:pic>
+              </a:graphicData>
+            </a:graphic>
+            <wp14:sizeRelH relativeFrom="margin">
+              <wp14:pctWidth>0</wp14:pctWidth>
+            </wp14:sizeRelH>
+            <wp14:sizeRelV relativeFrom="margin">
+              <wp14:pctHeight>0</wp14:pctHeight>
+            </wp14:sizeRelV>
+          </wp:anchor>
+        </w:drawing>
+      </w:r>
+    </w:p>
+    <w:p>
+      <w:pPr>
+        <w:rPr>
+          <w:lang w:val="en-US"/>
+        </w:rPr>
+      </w:pPr>
+    </w:p>
+    <w:p>
+      <w:pPr>
+        <w:rPr>
+          <w:lang w:val="en-US"/>
+        </w:rPr>
+      </w:pPr>
+    </w:p>
+    <w:p>
+      <w:r>
+        <w:rPr>
+          <w:noProof/>
+        </w:rPr>
+        <w:lastRenderedPageBreak/>
+        <mc:AlternateContent>
+          <mc:Choice Requires="wps">
+            <w:drawing>
+              <wp:anchor distT="0" distB="0" distL="114300" distR="114300" simplePos="0" relativeHeight="251728896" behindDoc="0" locked="0" layoutInCell="1" allowOverlap="1" wp14:anchorId="234D8990" wp14:editId="02E85C53">
+                <wp:simplePos x="0" y="0"/>
+                <wp:positionH relativeFrom="column">
+                  <wp:posOffset>343535</wp:posOffset>
+                </wp:positionH>
+                <wp:positionV relativeFrom="paragraph">
+                  <wp:posOffset>3415665</wp:posOffset>
+                </wp:positionV>
+                <wp:extent cx="4494530" cy="635"/>
+                <wp:effectExtent l="0" t="0" r="0" b="0"/>
+                <wp:wrapTopAndBottom/>
+                <wp:docPr id="1574824663" name="Text Box 1"/>
+                <wp:cNvGraphicFramePr/>
+                <a:graphic xmlns:a="http://schemas.openxmlformats.org/drawingml/2006/main">
+                  <a:graphicData uri="http://schemas.microsoft.com/office/word/2010/wordprocessingShape">
+                    <wps:wsp>
+                      <wps:cNvSpPr txBox="1"/>
+                      <wps:spPr>
+                        <a:xfrm>
+                          <a:off x="0" y="0"/>
+                          <a:ext cx="4494530" cy="635"/>
+                        </a:xfrm>
+                        <a:prstGeom prst="rect">
+                          <a:avLst/>
+                        </a:prstGeom>
+                        <a:solidFill>
+                          <a:prstClr val="white"/>
+                        </a:solidFill>
+                        <a:ln>
+                          <a:noFill/>
+                        </a:ln>
+                      </wps:spPr>
+                      <wps:txbx>
+                        <w:txbxContent>
+                          <w:p>
+                            <w:pPr>
+                              <w:pStyle w:val="Caption"/>
+                              <w:rPr>
+                                <w:lang w:val="en-US"/>
+                              </w:rPr>
+                            </w:pPr>
+                            <w:r>
+                              <w:t xml:space="preserve">Abbildung </w:t>
+                            </w:r>
+                            <w:r>
+                              <w:fldChar w:fldCharType="begin"/>
+                            </w:r>
+                            <w:r>
+                              <w:instrText xml:space="preserve"> SEQ Abbildung \* ARABIC </w:instrText>
+                            </w:r>
+                            <w:r>
+                              <w:fldChar w:fldCharType="separate"/>
+                            </w:r>
+                            <w:r>
+                              <w:rPr>
+                                <w:noProof/>
+                              </w:rPr>
+                              <w:t>10</w:t>
+                            </w:r>
+                            <w:r>
+                              <w:fldChar w:fldCharType="end"/>
+                            </w:r>
+                            <w:r>
+                              <w:t>: 30 kHz @ 88.2 kHz</w:t>
+                            </w:r>
+                          </w:p>
+                        </w:txbxContent>
+                      </wps:txbx>
+                      <wps:bodyPr rot="0" spcFirstLastPara="0" vertOverflow="overflow" horzOverflow="overflow" vert="horz" wrap="square" lIns="0" tIns="0" rIns="0" bIns="0" numCol="1" spcCol="0" rtlCol="0" fromWordArt="0" anchor="t" anchorCtr="0" forceAA="0" compatLnSpc="1">
+                        <a:prstTxWarp prst="textNoShape">
+                          <a:avLst/>
+                        </a:prstTxWarp>
+                        <a:spAutoFit/>
+                      </wps:bodyPr>
+                    </wps:wsp>
+                  </a:graphicData>
+                </a:graphic>
+              </wp:anchor>
+            </w:drawing>
+          </mc:Choice>
+          <mc:Fallback>
+            <w:pict>
+              <v:shape w14:anchorId="234D8990" id="_x0000_s1039" type="#_x0000_t202" style="position:absolute;left:0;text-align:left;margin-left:27.05pt;margin-top:268.95pt;width:353.9pt;height:.05pt;z-index:251728896;visibility:visible;mso-wrap-style:square;mso-wrap-distance-left:9pt;mso-wrap-distance-top:0;mso-wrap-distance-right:9pt;mso-wrap-distance-bottom:0;mso-position-horizontal:absolute;mso-position-horizontal-relative:text;mso-position-vertical:absolute;mso-position-vertical-relative:text;v-text-anchor:top" o:gfxdata="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" stroked="f">
+                <v:textbox style="mso-fit-shape-to-text:t" inset="0,0,0,0">
+                  <w:txbxContent>
+                    <w:p>
+                      <w:pPr>
+                        <w:pStyle w:val="Caption"/>
+                        <w:rPr>
+                          <w:lang w:val="en-US"/>
+                        </w:rPr>
+                      </w:pPr>
+                      <w:r>
+                        <w:t xml:space="preserve">Abbildung </w:t>
+                      </w:r>
+                      <w:r>
+                        <w:fldChar w:fldCharType="begin"/>
+                      </w:r>
+                      <w:r>
+                        <w:instrText xml:space="preserve"> SEQ Abbildung \* ARABIC </w:instrText>
+                      </w:r>
+                      <w:r>
+                        <w:fldChar w:fldCharType="separate"/>
+                      </w:r>
+                      <w:r>
+                        <w:rPr>
+                          <w:noProof/>
+                        </w:rPr>
+                        <w:t>10</w:t>
+                      </w:r>
+                      <w:r>
+                        <w:fldChar w:fldCharType="end"/>
+                      </w:r>
+                      <w:r>
+                        <w:t>: 30 kHz @ 88.2 kHz</w:t>
+                      </w:r>
+                    </w:p>
+                  </w:txbxContent>
+                </v:textbox>
+                <w10:wrap type="topAndBottom"/>
+              </v:shape>
+            </w:pict>
+          </mc:Fallback>
+        </mc:AlternateContent>
+      </w:r>
+      <w:r>
+        <w:rPr>
+          <w:lang w:val="en-US"/>
+        </w:rPr>
+        <w:drawing>
+          <wp:anchor distT="0" distB="0" distL="114300" distR="114300" simplePos="0" relativeHeight="251726848" behindDoc="0" locked="0" layoutInCell="1" allowOverlap="1" wp14:anchorId="5DDB5D14" wp14:editId="3F67ACA1">
+            <wp:simplePos x="0" y="0"/>
+            <wp:positionH relativeFrom="margin">
+              <wp:align>center</wp:align>
+            </wp:positionH>
+            <wp:positionV relativeFrom="paragraph">
+              <wp:posOffset>24911</wp:posOffset>
+            </wp:positionV>
+            <wp:extent cx="4494530" cy="3333750"/>
+            <wp:effectExtent l="0" t="0" r="1270" b="0"/>
+            <wp:wrapTopAndBottom/>
+            <wp:docPr id="585484012" name="Picture 1" descr="A screenshot of a computer&#10;&#10;AI-generated content may be incorrect."/>
+            <wp:cNvGraphicFramePr>
+              <a:graphicFrameLocks xmlns:a="http://schemas.openxmlformats.org/drawingml/2006/main" noChangeAspect="1"/>
+            </wp:cNvGraphicFramePr>
+            <a:graphic xmlns:a="http://schemas.openxmlformats.org/drawingml/2006/main">
+              <a:graphicData uri="http://schemas.openxmlformats.org/drawingml/2006/picture">
+                <pic:pic xmlns:pic="http://schemas.openxmlformats.org/drawingml/2006/picture">
+                  <pic:nvPicPr>
+                    <pic:cNvPr id="585484012" name="Picture 1" descr="A screenshot of a computer&#10;&#10;AI-generated content may be incorrect."/>
+                    <pic:cNvPicPr/>
+                  </pic:nvPicPr>
+                  <pic:blipFill>
+                    <a:blip r:embed="rId17" cstate="print">
+                      <a:extLst>
+                        <a:ext uri="{28A0092B-C50C-407E-A947-70E740481C1C}">
+                          <a14:useLocalDpi xmlns:a14="http://schemas.microsoft.com/office/drawing/2010/main" val="0"/>
+                        </a:ext>
+                      </a:extLst>
+                    </a:blip>
+                    <a:stretch>
+                      <a:fillRect/>
+                    </a:stretch>
+                  </pic:blipFill>
+                  <pic:spPr>
+                    <a:xfrm>
+                      <a:off x="0" y="0"/>
+                      <a:ext cx="4494530" cy="3333750"/>
+                    </a:xfrm>
+                    <a:prstGeom prst="rect">
+                      <a:avLst/>
+                    </a:prstGeom>
+                  </pic:spPr>
+                </pic:pic>
+              </a:graphicData>
+            </a:graphic>
+            <wp14:sizeRelH relativeFrom="margin">
+              <wp14:pctWidth>0</wp14:pctWidth>
+            </wp14:sizeRelH>
+            <wp14:sizeRelV relativeFrom="margin">
+              <wp14:pctHeight>0</wp14:pctHeight>
+            </wp14:sizeRelV>
+          </wp:anchor>
+        </w:drawing>
+      </w:r>
+      <w:r>
+        <w:t>Da 30 kHz mehr als die Hälfte von 44.1 kHz ist</w:t>
+      </w:r>
+      <w:r>
+        <w:t xml:space="preserve">, kann die Freuqenz nicht mehr richtig abgetastet werden. Das </w:t>
+      </w:r>
+      <w:r>
+        <w:t>Nyquist</w:t>
+      </w:r>
+      <w:r>
+        <w:t>-</w:t>
+      </w:r>
+      <w:r>
+        <w:t xml:space="preserve">Shannon </w:t>
+      </w:r>
+      <w:r>
+        <w:t xml:space="preserve">Theorem besagt, dass die Abtastfrequenz mehr als doppelt so groß wie die höchste vorkommende Frequenz sein soll, um die Frequenz richtig abzubilden. </w:t>
+      </w:r>
+      <w:r>
+        <w:sym w:font="Wingdings" w:char="F0E0"/>
+      </w:r>
+      <w:r>
+        <w:t xml:space="preserve"> Aliasing! </w:t>
+      </w:r>
+    </w:p>
+    <w:p/>
+    <w:p>
+      <w:pPr>
+        <w:pStyle w:val="Heading2"/>
+      </w:pPr>
+      <w:r>
+        <w:t>2.2</w:t>
+      </w:r>
+    </w:p>
+    <w:p>
+      <w:pPr>
+        <w:pStyle w:val="Quote"/>
+      </w:pPr>
+      <w:r>
+        <w:t>Importieren Sie die Sprachaufnahme ‘speech 48kHz.wav’ (siehe Kursunterlagen online) auf eine neue Spur im Projekt (drag&amp;drop). Rendern Sie die Sprachaufnahme mit einer Samplerate von 44.1kHz, 16kHz und 8kHz.</w:t>
+      </w:r>
+    </w:p>
+    <w:p>
+      <w:pPr>
+        <w:pStyle w:val="Quote"/>
+      </w:pPr>
+      <w:r>
+        <w:t xml:space="preserve"> Zeitbereich per drag&amp;drop in der Zeitleiste definieren, File -&gt; Render, folgende Parameter einstellen: ‘Directory’, ‘File Name’, ‘Samplerate’, und ‘Channel’ (mono) -&gt; Render 1 file anklicken. Die neuen Dateien ins Projekt importieren und abspielen. </w:t>
+      </w:r>
+    </w:p>
+    <w:p>
+      <w:pPr>
+        <w:pStyle w:val="Quote"/>
+      </w:pPr>
+      <w:r>
+        <w:t>Was sieht man am frequency analyzer? Was kann man akustisch wahrnehmen. Ab welcher Samplerate können Sie eine Verschlechterung der Audioqualität feststellen? Welche Anteile der Sprachaufnahme (Konsonanten, Vokale, Zischlaute?) haben sich verändert?</w:t>
+      </w:r>
+    </w:p>
+    <w:p/>
+    <w:p>
+      <w:pPr>
+        <w:jc w:val="left"/>
+      </w:pPr>
+      <w:r>
+        <w:br w:type="page"/>
+      </w:r>
+    </w:p>
+    <w:p>
+      <w:pPr>
+        <w:keepNext/>
+      </w:pPr>
+      <w:r>
+        <w:lastRenderedPageBreak/>
+        <w:drawing>
+          <wp:inline distT="0" distB="0" distL="0" distR="0" wp14:anchorId="054E2DAC" wp14:editId="73DDAAF4">
+            <wp:extent cx="5182870" cy="2360295"/>
+            <wp:effectExtent l="0" t="0" r="0" b="1905"/>
+            <wp:docPr id="1645506952" name="Picture 1" descr="A screenshot of a computer&#10;&#10;AI-generated content may be incorrect."/>
+            <wp:cNvGraphicFramePr>
+              <a:graphicFrameLocks xmlns:a="http://schemas.openxmlformats.org/drawingml/2006/main" noChangeAspect="1"/>
+            </wp:cNvGraphicFramePr>
+            <a:graphic xmlns:a="http://schemas.openxmlformats.org/drawingml/2006/main">
+              <a:graphicData uri="http://schemas.openxmlformats.org/drawingml/2006/picture">
+                <pic:pic xmlns:pic="http://schemas.openxmlformats.org/drawingml/2006/picture">
+                  <pic:nvPicPr>
+                    <pic:cNvPr id="1645506952" name="Picture 1" descr="A screenshot of a computer&#10;&#10;AI-generated content may be incorrect."/>
+                    <pic:cNvPicPr/>
+                  </pic:nvPicPr>
+                  <pic:blipFill>
+                    <a:blip r:embed="rId18"/>
+                    <a:stretch>
+                      <a:fillRect/>
+                    </a:stretch>
+                  </pic:blipFill>
+                  <pic:spPr>
+                    <a:xfrm>
+                      <a:off x="0" y="0"/>
+                      <a:ext cx="5182870" cy="2360295"/>
+                    </a:xfrm>
+                    <a:prstGeom prst="rect">
+                      <a:avLst/>
+                    </a:prstGeom>
+                  </pic:spPr>
+                </pic:pic>
+              </a:graphicData>
+            </a:graphic>
+          </wp:inline>
+        </w:drawing>
+      </w:r>
+    </w:p>
+    <w:p>
+      <w:pPr>
+        <w:pStyle w:val="Caption"/>
+      </w:pPr>
+      <w:r>
+        <w:t xml:space="preserve">Abbildung </w:t>
+      </w:r>
+      <w:r>
+        <w:fldChar w:fldCharType="begin"/>
+      </w:r>
+      <w:r>
+        <w:instrText xml:space="preserve"> SEQ Abbildung \* ARABIC </w:instrText>
+      </w:r>
+      <w:r>
+        <w:fldChar w:fldCharType="separate"/>
+      </w:r>
+      <w:r>
+        <w:rPr>
+          <w:noProof/>
+        </w:rPr>
+        <w:t>11</w:t>
+      </w:r>
+      <w:r>
+        <w:fldChar w:fldCharType="end"/>
+      </w:r>
+      <w:r>
+        <w:t>: 44.1 kHz</w:t>
+      </w:r>
+    </w:p>
+    <w:p/>
+    <w:p>
+      <w:pPr>
+        <w:keepNext/>
+      </w:pPr>
+      <w:r>
+        <w:drawing>
+          <wp:inline distT="0" distB="0" distL="0" distR="0" wp14:anchorId="26B933C5" wp14:editId="520FFCEA">
+            <wp:extent cx="5182870" cy="1973580"/>
+            <wp:effectExtent l="0" t="0" r="0" b="7620"/>
+            <wp:docPr id="43027106" name="Picture 1" descr="A screen shot of a computer&#10;&#10;AI-generated content may be incorrect."/>
+            <wp:cNvGraphicFramePr>
+              <a:graphicFrameLocks xmlns:a="http://schemas.openxmlformats.org/drawingml/2006/main" noChangeAspect="1"/>
+            </wp:cNvGraphicFramePr>
+            <a:graphic xmlns:a="http://schemas.openxmlformats.org/drawingml/2006/main">
+              <a:graphicData uri="http://schemas.openxmlformats.org/drawingml/2006/picture">
+                <pic:pic xmlns:pic="http://schemas.openxmlformats.org/drawingml/2006/picture">
+                  <pic:nvPicPr>
+                    <pic:cNvPr id="43027106" name="Picture 1" descr="A screen shot of a computer&#10;&#10;AI-generated content may be incorrect."/>
+                    <pic:cNvPicPr/>
+                  </pic:nvPicPr>
+                  <pic:blipFill>
+                    <a:blip r:embed="rId19"/>
+                    <a:stretch>
+                      <a:fillRect/>
+                    </a:stretch>
+                  </pic:blipFill>
+                  <pic:spPr>
+                    <a:xfrm>
+                      <a:off x="0" y="0"/>
+                      <a:ext cx="5182870" cy="1973580"/>
+                    </a:xfrm>
+                    <a:prstGeom prst="rect">
+                      <a:avLst/>
+                    </a:prstGeom>
+                  </pic:spPr>
+                </pic:pic>
+              </a:graphicData>
+            </a:graphic>
+          </wp:inline>
+        </w:drawing>
+      </w:r>
+    </w:p>
+    <w:p>
+      <w:pPr>
+        <w:pStyle w:val="Caption"/>
+      </w:pPr>
+      <w:r>
+        <w:t xml:space="preserve">Abbildung </w:t>
+      </w:r>
+      <w:r>
+        <w:fldChar w:fldCharType="begin"/>
+      </w:r>
+      <w:r>
+        <w:instrText xml:space="preserve"> SEQ Abbildung \* ARABIC </w:instrText>
+      </w:r>
+      <w:r>
+        <w:fldChar w:fldCharType="separate"/>
+      </w:r>
+      <w:r>
+        <w:rPr>
+          <w:noProof/>
+        </w:rPr>
+        <w:t>12</w:t>
+      </w:r>
+      <w:r>
+        <w:fldChar w:fldCharType="end"/>
+      </w:r>
+      <w:r>
+        <w:t>: 16 kHz</w:t>
+      </w:r>
+    </w:p>
+    <w:p>
+      <w:r>
+        <w:rPr>
+          <w:noProof/>
+        </w:rPr>
+        <mc:AlternateContent>
+          <mc:Choice Requires="wps">
+            <w:drawing>
+              <wp:anchor distT="0" distB="0" distL="114300" distR="114300" simplePos="0" relativeHeight="251731968" behindDoc="0" locked="0" layoutInCell="1" allowOverlap="1" wp14:anchorId="13D7CF49" wp14:editId="5D147014">
+                <wp:simplePos x="0" y="0"/>
+                <wp:positionH relativeFrom="column">
+                  <wp:posOffset>8255</wp:posOffset>
+                </wp:positionH>
+                <wp:positionV relativeFrom="paragraph">
+                  <wp:posOffset>2321560</wp:posOffset>
+                </wp:positionV>
+                <wp:extent cx="5182870" cy="635"/>
+                <wp:effectExtent l="0" t="0" r="0" b="0"/>
+                <wp:wrapTopAndBottom/>
+                <wp:docPr id="1563101553" name="Text Box 1"/>
+                <wp:cNvGraphicFramePr/>
+                <a:graphic xmlns:a="http://schemas.openxmlformats.org/drawingml/2006/main">
+                  <a:graphicData uri="http://schemas.microsoft.com/office/word/2010/wordprocessingShape">
+                    <wps:wsp>
+                      <wps:cNvSpPr txBox="1"/>
+                      <wps:spPr>
+                        <a:xfrm>
+                          <a:off x="0" y="0"/>
+                          <a:ext cx="5182870" cy="635"/>
+                        </a:xfrm>
+                        <a:prstGeom prst="rect">
+                          <a:avLst/>
+                        </a:prstGeom>
+                        <a:solidFill>
+                          <a:prstClr val="white"/>
+                        </a:solidFill>
+                        <a:ln>
+                          <a:noFill/>
+                        </a:ln>
+                      </wps:spPr>
+                      <wps:txbx>
+                        <w:txbxContent>
+                          <w:p>
+                            <w:pPr>
+                              <w:pStyle w:val="Caption"/>
+                            </w:pPr>
+                            <w:r>
+                              <w:t xml:space="preserve">Abbildung </w:t>
+                            </w:r>
+                            <w:r>
+                              <w:fldChar w:fldCharType="begin"/>
+                            </w:r>
+                            <w:r>
+                              <w:instrText xml:space="preserve"> SEQ Abbildung \* ARABIC </w:instrText>
+                            </w:r>
+                            <w:r>
+                              <w:fldChar w:fldCharType="separate"/>
+                            </w:r>
+                            <w:r>
+                              <w:rPr>
+                                <w:noProof/>
+                              </w:rPr>
+                              <w:t>13</w:t>
+                            </w:r>
+                            <w:r>
+                              <w:fldChar w:fldCharType="end"/>
+                            </w:r>
+                            <w:r>
+                              <w:t>: 8 kHz</w:t>
+                            </w:r>
+                            <w:r>
+                              <w:tab/>
+                            </w:r>
+                          </w:p>
+                        </w:txbxContent>
+                      </wps:txbx>
+                      <wps:bodyPr rot="0" spcFirstLastPara="0" vertOverflow="overflow" horzOverflow="overflow" vert="horz" wrap="square" lIns="0" tIns="0" rIns="0" bIns="0" numCol="1" spcCol="0" rtlCol="0" fromWordArt="0" anchor="t" anchorCtr="0" forceAA="0" compatLnSpc="1">
+                        <a:prstTxWarp prst="textNoShape">
+                          <a:avLst/>
+                        </a:prstTxWarp>
+                        <a:spAutoFit/>
+                      </wps:bodyPr>
+                    </wps:wsp>
+                  </a:graphicData>
+                </a:graphic>
+              </wp:anchor>
+            </w:drawing>
+          </mc:Choice>
+          <mc:Fallback>
+            <w:pict>
+              <v:shape w14:anchorId="13D7CF49" id="_x0000_s1040" type="#_x0000_t202" style="position:absolute;left:0;text-align:left;margin-left:.65pt;margin-top:182.8pt;width:408.1pt;height:.05pt;z-index:251731968;visibility:visible;mso-wrap-style:square;mso-wrap-distance-left:9pt;mso-wrap-distance-top:0;mso-wrap-distance-right:9pt;mso-wrap-distance-bottom:0;mso-position-horizontal:absolute;mso-position-horizontal-relative:text;mso-position-vertical:absolute;mso-position-vertical-relative:text;v-text-anchor:top" o:gfxdata="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" stroked="f">
+                <v:textbox style="mso-fit-shape-to-text:t" inset="0,0,0,0">
+                  <w:txbxContent>
+                    <w:p>
+                      <w:pPr>
+                        <w:pStyle w:val="Caption"/>
+                      </w:pPr>
+                      <w:r>
+                        <w:t xml:space="preserve">Abbildung </w:t>
+                      </w:r>
+                      <w:r>
+                        <w:fldChar w:fldCharType="begin"/>
+                      </w:r>
+                      <w:r>
+                        <w:instrText xml:space="preserve"> SEQ Abbildung \* ARABIC </w:instrText>
+                      </w:r>
+                      <w:r>
+                        <w:fldChar w:fldCharType="separate"/>
+                      </w:r>
+                      <w:r>
+                        <w:rPr>
+                          <w:noProof/>
+                        </w:rPr>
+                        <w:t>13</w:t>
+                      </w:r>
+                      <w:r>
+                        <w:fldChar w:fldCharType="end"/>
+                      </w:r>
+                      <w:r>
+                        <w:t>: 8 kHz</w:t>
+                      </w:r>
+                      <w:r>
+                        <w:tab/>
+                      </w:r>
+                    </w:p>
+                  </w:txbxContent>
+                </v:textbox>
+                <w10:wrap type="topAndBottom"/>
+              </v:shape>
+            </w:pict>
+          </mc:Fallback>
+        </mc:AlternateContent>
+      </w:r>
+      <w:r>
+        <w:drawing>
+          <wp:anchor distT="0" distB="0" distL="114300" distR="114300" simplePos="0" relativeHeight="251729920" behindDoc="0" locked="0" layoutInCell="1" allowOverlap="1" wp14:anchorId="3F264E90" wp14:editId="741C95B1">
+            <wp:simplePos x="0" y="0"/>
+            <wp:positionH relativeFrom="margin">
+              <wp:posOffset>8670</wp:posOffset>
+            </wp:positionH>
+            <wp:positionV relativeFrom="paragraph">
+              <wp:posOffset>325151</wp:posOffset>
+            </wp:positionV>
+            <wp:extent cx="5182870" cy="2258060"/>
+            <wp:effectExtent l="0" t="0" r="0" b="8890"/>
+            <wp:wrapTopAndBottom/>
+            <wp:docPr id="202492130" name="Picture 1" descr="A screenshot of a computer&#10;&#10;AI-generated content may be incorrect."/>
+            <wp:cNvGraphicFramePr>
+              <a:graphicFrameLocks xmlns:a="http://schemas.openxmlformats.org/drawingml/2006/main" noChangeAspect="1"/>
+            </wp:cNvGraphicFramePr>
+            <a:graphic xmlns:a="http://schemas.openxmlformats.org/drawingml/2006/main">
+              <a:graphicData uri="http://schemas.openxmlformats.org/drawingml/2006/picture">
+                <pic:pic xmlns:pic="http://schemas.openxmlformats.org/drawingml/2006/picture">
+                  <pic:nvPicPr>
+                    <pic:cNvPr id="202492130" name="Picture 1" descr="A screenshot of a computer&#10;&#10;AI-generated content may be incorrect."/>
+                    <pic:cNvPicPr/>
+                  </pic:nvPicPr>
+                  <pic:blipFill>
+                    <a:blip r:embed="rId20" cstate="print">
+                      <a:extLst>
+                        <a:ext uri="{28A0092B-C50C-407E-A947-70E740481C1C}">
+                          <a14:useLocalDpi xmlns:a14="http://schemas.microsoft.com/office/drawing/2010/main" val="0"/>
+                        </a:ext>
+                      </a:extLst>
+                    </a:blip>
+                    <a:stretch>
+                      <a:fillRect/>
+                    </a:stretch>
+                  </pic:blipFill>
+                  <pic:spPr>
+                    <a:xfrm>
+                      <a:off x="0" y="0"/>
+                      <a:ext cx="5182870" cy="2258060"/>
+                    </a:xfrm>
+                    <a:prstGeom prst="rect">
+                      <a:avLst/>
+                    </a:prstGeom>
+                  </pic:spPr>
+                </pic:pic>
+              </a:graphicData>
+            </a:graphic>
+          </wp:anchor>
+        </w:drawing>
+      </w:r>
+    </w:p>
+    <w:p/>
+    <w:p>
+      <w:r>
+        <w:lastRenderedPageBreak/>
+        <w:t>Am Frequenz Analyzer sieht man, dass mit niedrigerer Samplerate, höhere Frequenzen verloren gehen.</w:t>
+      </w:r>
+      <w:r>
+        <w:t xml:space="preserve"> Akustisch wahrnehmbar ist, dass es sich immer </w:t>
+      </w:r>
+      <w:r>
+        <w:t>tiefer</w:t>
+      </w:r>
+      <w:r>
+        <w:t xml:space="preserve"> und unklarer anhört. </w:t>
+      </w:r>
+      <w:r>
+        <w:t>Vor allem die Zischlaute</w:t>
+      </w:r>
+      <w:r>
+        <w:t xml:space="preserve"> und manche Konsonanten</w:t>
+      </w:r>
+      <w:r>
+        <w:t xml:space="preserve"> verschwinden mit den niedrigeren Samplerates. Es wirkt wie ein Tiefpassfilter. </w:t>
       </w:r>
     </w:p>
     <w:sectPr>
-      <w:footerReference w:type="default" r:id="rId8"/>
+      <w:footerReference w:type="default" r:id="rId21"/>
       <w:pgSz w:w="11906" w:h="16838" w:code="9"/>
       <w:pgMar w:top="1872" w:right="1872" w:bottom="1872" w:left="1872" w:header="706" w:footer="706" w:gutter="0"/>
       <w:pgNumType w:start="0"/>
@@ -1920,6 +4399,18 @@
       <w:color w:val="666666"/>
     </w:rPr>
   </w:style>
+  <w:style w:type="character" w:styleId="SubtleEmphasis">
+    <w:name w:val="Subtle Emphasis"/>
+    <w:basedOn w:val="DefaultParagraphFont"/>
+    <w:uiPriority w:val="19"/>
+    <w:qFormat/>
+    <w:rsid w:val="00C46483"/>
+    <w:rPr>
+      <w:i/>
+      <w:iCs/>
+      <w:color w:val="404040" w:themeColor="text1" w:themeTint="BF"/>
+    </w:rPr>
+  </w:style>
 </w:styles>
 </file>
 

</xml_diff>